<commit_message>
Protocol Translator, Rev21 library, ARTG ingest pipeline, report renderer
- Protocol Translator (/translate): ARTG product → N of 1 pod formula
  - Sponsor/product search, multi-product selection, units-per-day
  - Direct translation, class substitutes, N of 1 exclusives
  - Granule ± adjustment, exclude/restore per-active toggle
  - Max dose display, live pod gauge, save to My Formulations
- ARTG ingest pipeline (scripts/ingest-artg-export.ts): TGA export → candidates.json
  - Moiety registry, library map, class substitute map
  - Alias file (data/artg-aliases.json), class substitutes (data/class-substitutes.json)
- Library updated to Rev21 (109 ingredients) with build-library-from-excel.ts
- Health analysis HTML/PDF report renderer (app/reports/)
- Formula export route (app/api/formula-export/)
- Dev cache reset route (app/api/dev/reset-cache/)
- Schema v0.4.8: SPP panel class, questionnaire-only input path
- Prompt v0.6.9: StrateGene GP support
</commit_message>
<xml_diff>
--- a/generated-docs/Nof1_HealthAnalysis_SUB-2026-003_DRAFT.docx
+++ b/generated-docs/Nof1_HealthAnalysis_SUB-2026-003_DRAFT.docx
@@ -689,7 +689,7 @@
                 <w:sz w:val="20"/>
                 <w:szCs w:val="20"/>
               </w:rPr>
-              <w:t xml:space="preserve">SUB-2026-004</w:t>
+              <w:t xml:space="preserve">SUB-2026-NS-001</w:t>
             </w:r>
           </w:p>
         </w:tc>
@@ -750,7 +750,7 @@
                 <w:sz w:val="20"/>
                 <w:szCs w:val="20"/>
               </w:rPr>
-              <w:t xml:space="preserve">31 May 2026, 8:58 am</w:t>
+              <w:t xml:space="preserve">12 Aug 2026, 4:16 pm</w:t>
             </w:r>
           </w:p>
         </w:tc>
@@ -793,7 +793,7 @@
           <w:sz w:val="22"/>
           <w:szCs w:val="22"/>
         </w:rPr>
-        <w:t xml:space="preserve">EndoSCAN findings in this 53-year-old male show a pattern consistent with low total urinary cortisol (HPA-hypocortisolism), reduced oestrogen quotient (E3 relative to E1+E2 below the laboratory reference framework), and low Phase I 2-OH and 4-OH oestrogen metabolites with a low 2-OH:16-OH ratio — patterns warranting practitioner consideration of adaptogenic, oestrogen-metabolism-supportive, and antioxidant/methylation cofactor strategies.</w:t>
+        <w:t xml:space="preserve">NutriSTAT panel showing an inflammatory-metabolic pattern (elevated hsCRP, elevated VLDL) with a thyroid-conversion-impaired pattern (low FT3:RT3 ratio) and mild-moderate toxicant burden (aluminium, lead detected; elevated Cu:Zn ratio at upper reference).</w:t>
       </w:r>
     </w:p>
     <w:p>
@@ -836,7 +836,7 @@
           <w:sz w:val="22"/>
           <w:szCs w:val="22"/>
         </w:rPr>
-        <w:t xml:space="preserve">HPA-hypocortisolism</w:t>
+        <w:t xml:space="preserve">Inflammatory-metabolic</w:t>
       </w:r>
     </w:p>
     <w:p>
@@ -851,7 +851,7 @@
           <w:sz w:val="20"/>
           <w:szCs w:val="20"/>
         </w:rPr>
-        <w:t xml:space="preserve">Supporting findings: Total 24hr Cortisol 24.91 ug/gCR (reference 50.00–200.00) — low, DHEA 16.27 ug/gCR within reference but in lower portion of range, Symptom cluster including fatigue (morning, mental, evening), difficulty sleeping, burned-out feeling, decreased stamina</w:t>
+        <w:t xml:space="preserve">Supporting findings: hsCRP 6.88 mg/L (elevated), VLDL 0.7 mmol/L (mildly elevated), Fibrinogen 4.5 g/L (upper reference), Fasting glucose 5.4 mmol/L (upper reference)</w:t>
       </w:r>
     </w:p>
     <w:p>
@@ -878,7 +878,7 @@
           <w:sz w:val="22"/>
           <w:szCs w:val="22"/>
         </w:rPr>
-        <w:t xml:space="preserve">16-OH-dominant oestrogen metabolism (low 2:16 ratio)</w:t>
+        <w:t xml:space="preserve">Thyroid-conversion-impaired</w:t>
       </w:r>
     </w:p>
     <w:p>
@@ -893,7 +893,7 @@
           <w:sz w:val="20"/>
           <w:szCs w:val="20"/>
         </w:rPr>
-        <w:t xml:space="preserve">Supporting findings: 2-OH(E1+E2)/16-OHE1 ratio 0.60 (reference 1.10–5.60), 2-OH Estrone 0.04 ug/gCR (reference 0.10–1.88), Estrogen Quotient E3/(E1+E2) 0.24 (reference &gt;0.25)</w:t>
+        <w:t xml:space="preserve">Supporting findings: FT3:Reverse T3 ratio 0.787 (below reference), Reverse T3 449.6 pmol/L (upper reference), FT3 3.5 pmol/L (low-normal), Thyroid antibodies negative (TPO 9.0, Tg 16.3, TRAb 0.8)</w:t>
       </w:r>
     </w:p>
     <w:p>
@@ -920,7 +920,7 @@
           <w:sz w:val="22"/>
           <w:szCs w:val="22"/>
         </w:rPr>
-        <w:t xml:space="preserve">Low 2-OH substrate with preserved COMT methylation capacity</w:t>
+        <w:t xml:space="preserve">Toxicant-burdened (mild)</w:t>
       </w:r>
     </w:p>
     <w:p>
@@ -935,7 +935,49 @@
           <w:sz w:val="20"/>
           <w:szCs w:val="20"/>
         </w:rPr>
-        <w:t xml:space="preserve">Supporting findings: 2-MeOH Estrone 0.01 ug/gCR (low) but 2-MeOH E1 / 2-OH E1 ratio 0.30 within reference (0.05–0.50), 4-MeOH E2 / 4-OH E2 ratio 4.39 (above reference) suggesting active methylation capacity</w:t>
+        <w:t xml:space="preserve">Supporting findings: Blood aluminium 28.13 µg/L (upper reference), Blood lead 14.05 µg/L (detectable within reference), Cu:Zn ratio 1.50 (upper reference), Plasma zinc 9.9 µmol/L (lower portion of reference), NAC organic acid 0.02 mmol/molCr (at lower reference)</w:t>
+      </w:r>
+    </w:p>
+    <w:p>
+      <w:pPr>
+        <w:spacing w:after="60"/>
+      </w:pPr>
+      <w:r>
+        <w:rPr>
+          <w:rFonts w:ascii="Roboto" w:cs="Roboto" w:eastAsia="Roboto" w:hAnsi="Roboto"/>
+          <w:b/>
+          <w:bCs/>
+          <w:color w:val="C3AF88"/>
+          <w:sz w:val="22"/>
+          <w:szCs w:val="22"/>
+        </w:rPr>
+        <w:t xml:space="preserve">• </w:t>
+      </w:r>
+      <w:r>
+        <w:rPr>
+          <w:rFonts w:ascii="Roboto" w:cs="Roboto" w:eastAsia="Roboto" w:hAnsi="Roboto"/>
+          <w:b/>
+          <w:bCs/>
+          <w:color w:val="000000"/>
+          <w:sz w:val="22"/>
+          <w:szCs w:val="22"/>
+        </w:rPr>
+        <w:t xml:space="preserve">Mitochondrial/citric-acid-cycle sluggish</w:t>
+      </w:r>
+    </w:p>
+    <w:p>
+      <w:pPr>
+        <w:spacing w:after="120"/>
+        <w:ind w:left="360"/>
+      </w:pPr>
+      <w:r>
+        <w:rPr>
+          <w:rFonts w:ascii="Roboto" w:cs="Roboto" w:eastAsia="Roboto" w:hAnsi="Roboto"/>
+          <w:color w:val="666666"/>
+          <w:sz w:val="20"/>
+          <w:szCs w:val="20"/>
+        </w:rPr>
+        <w:t xml:space="preserve">Supporting findings: Citric acid 45.7 (lower reference), Isocitric acid 6.21 (lower reference), α-Ketoglutaric acid 4.78 (lower reference), Succinic acid 1.12 (lower reference), CoQ10 flagged at 90 mg on nutritional guide</w:t>
       </w:r>
     </w:p>
     <w:p>
@@ -970,7 +1012,7 @@
           <w:sz w:val="22"/>
           <w:szCs w:val="22"/>
         </w:rPr>
-        <w:t xml:space="preserve">The following 13 biomarker findings are surfaced for practitioner review. Each finding includes a hedged interpretation, possible contributors per the published literature, and the relevance of the finding to the formulation strategy.</w:t>
+        <w:t xml:space="preserve">The following 14 biomarker findings are surfaced for practitioner review. Each finding includes a hedged interpretation, possible contributors per the published literature, and the relevance of the finding to the formulation strategy.</w:t>
       </w:r>
     </w:p>
     <w:p>
@@ -986,16 +1028,16 @@
           <w:sz w:val="22"/>
           <w:szCs w:val="22"/>
         </w:rPr>
-        <w:t xml:space="preserve">Total 24hr Cortisol</w:t>
-      </w:r>
-      <w:r>
-        <w:rPr>
-          <w:rFonts w:ascii="Roboto" w:cs="Roboto" w:eastAsia="Roboto" w:hAnsi="Roboto"/>
-          <w:color w:val="000000"/>
-          <w:sz w:val="22"/>
-          <w:szCs w:val="22"/>
-        </w:rPr>
-        <w:t xml:space="preserve">   24.91 ug/gCR</w:t>
+        <w:t xml:space="preserve">hsCRP</w:t>
+      </w:r>
+      <w:r>
+        <w:rPr>
+          <w:rFonts w:ascii="Roboto" w:cs="Roboto" w:eastAsia="Roboto" w:hAnsi="Roboto"/>
+          <w:color w:val="000000"/>
+          <w:sz w:val="22"/>
+          <w:szCs w:val="22"/>
+        </w:rPr>
+        <w:t xml:space="preserve">   6.88 mg/L</w:t>
       </w:r>
       <w:r>
         <w:rPr>
@@ -1006,7 +1048,7 @@
           <w:sz w:val="20"/>
           <w:szCs w:val="20"/>
         </w:rPr>
-        <w:t xml:space="preserve">   (ref: 50.00–200.00 ug/gCR)</w:t>
+        <w:t xml:space="preserve">   (ref: 0.00–5.00 mg/L)</w:t>
       </w:r>
     </w:p>
     <w:p>
@@ -1031,7 +1073,7 @@
           <w:sz w:val="20"/>
           <w:szCs w:val="20"/>
         </w:rPr>
-        <w:t xml:space="preserve">Below the laboratory reference framework — pattern consistent with reduced adrenal glucocorticoid output. The laboratory comment notes this is associated with chronic HPA axis suppression or prolonged physiological stress per published frameworks.</w:t>
+        <w:t xml:space="preserve">Mildly elevated per laboratory reference framework — pattern consistent with low-grade systemic inflammation.</w:t>
       </w:r>
     </w:p>
     <w:p>
@@ -1056,7 +1098,7 @@
           <w:sz w:val="20"/>
           <w:szCs w:val="20"/>
         </w:rPr>
-        <w:t xml:space="preserve">Published literature identifies chronic stress, disrupted circadian rhythm, prolonged HPA activation followed by attenuation, sleep disruption, and undernutrition as factors that may contribute to reduced urinary cortisol output — practitioner to assess relevance to this patient.</w:t>
+        <w:t xml:space="preserve">Published literature identifies dietary factors, adiposity, subclinical infections, sleep disruption, and oxidative stress as factors that may contribute to elevated hsCRP — practitioner to assess relevance.</w:t>
       </w:r>
     </w:p>
     <w:p>
@@ -1081,7 +1123,7 @@
           <w:sz w:val="20"/>
           <w:szCs w:val="20"/>
         </w:rPr>
-        <w:t xml:space="preserve">Drives the thyroid_adaptogenic axis (adaptogen support — ashwagandha, rhodiola, american ginseng) and the vitamin_d_c_neurotransmitter axis (vitamin C as adrenal cofactor) and the b_vitamins_methylation axis (B5 / pantothenic acid as CoA precursor and specific adrenal cofactor).</w:t>
+        <w:t xml:space="preserve">Primary driver for the anti_inflammatory_core axis — supports practitioner consideration of curcumin, boswellia, quercetin, and resveratrol.</w:t>
       </w:r>
     </w:p>
     <w:p>
@@ -1097,16 +1139,16 @@
           <w:sz w:val="22"/>
           <w:szCs w:val="22"/>
         </w:rPr>
-        <w:t xml:space="preserve">Estrogen Quotient E3/(E1+E2)</w:t>
-      </w:r>
-      <w:r>
-        <w:rPr>
-          <w:rFonts w:ascii="Roboto" w:cs="Roboto" w:eastAsia="Roboto" w:hAnsi="Roboto"/>
-          <w:color w:val="000000"/>
-          <w:sz w:val="22"/>
-          <w:szCs w:val="22"/>
-        </w:rPr>
-        <w:t xml:space="preserve">   0.24 (ratio)</w:t>
+        <w:t xml:space="preserve">FT3:Reverse T3 Ratio</w:t>
+      </w:r>
+      <w:r>
+        <w:rPr>
+          <w:rFonts w:ascii="Roboto" w:cs="Roboto" w:eastAsia="Roboto" w:hAnsi="Roboto"/>
+          <w:color w:val="000000"/>
+          <w:sz w:val="22"/>
+          <w:szCs w:val="22"/>
+        </w:rPr>
+        <w:t xml:space="preserve">   0.787</w:t>
       </w:r>
       <w:r>
         <w:rPr>
@@ -1117,7 +1159,7 @@
           <w:sz w:val="20"/>
           <w:szCs w:val="20"/>
         </w:rPr>
-        <w:t xml:space="preserve">   (ref: &gt;0.25)</w:t>
+        <w:t xml:space="preserve">   (ref: 1.200–2.200)</w:t>
       </w:r>
     </w:p>
     <w:p>
@@ -1142,7 +1184,7 @@
           <w:sz w:val="20"/>
           <w:szCs w:val="20"/>
         </w:rPr>
-        <w:t xml:space="preserve">Marginally below the laboratory reference framework — pattern consistent with relative E3 reduction versus more potent E1+E2.</w:t>
+        <w:t xml:space="preserve">Below laboratory optimal range — pattern suggesting impaired peripheral T4 to T3 conversion for practitioner consideration.</w:t>
       </w:r>
     </w:p>
     <w:p>
@@ -1167,7 +1209,7 @@
           <w:sz w:val="20"/>
           <w:szCs w:val="20"/>
         </w:rPr>
-        <w:t xml:space="preserve">Published literature identifies impaired Phase I 2-hydroxylation, impaired 16α-hydroxylation balance, and incomplete oestrogen conjugation as factors that may contribute to a low E3 quotient — practitioner to assess relevance.</w:t>
+        <w:t xml:space="preserve">Published literature identifies inflammation, cortisol dysregulation, selenium/zinc status, and caloric restriction as factors that may contribute to this pattern — practitioner to assess relevance.</w:t>
       </w:r>
     </w:p>
     <w:p>
@@ -1192,7 +1234,7 @@
           <w:sz w:val="20"/>
           <w:szCs w:val="20"/>
         </w:rPr>
-        <w:t xml:space="preserve">Supports inclusion of hormone_metabolism axis ingredients (DIM to support 2-OH pathway, calcium D-glucarate for glucuronidation/beta-glucuronidase inhibition, milk thistle for Phase II hepatic conjugation).</w:t>
+        <w:t xml:space="preserve">Supports practitioner consideration of the thyroid_adaptogenic axis — zinc (deiodinase cofactor), ashwagandha, and rhodiola may be considered. Iodine is not indicated at elevated dose here as antibodies are negative but selenium is at 90% of upper RBC reference — see binding exclusion.</w:t>
       </w:r>
     </w:p>
     <w:p>
@@ -1208,16 +1250,16 @@
           <w:sz w:val="22"/>
           <w:szCs w:val="22"/>
         </w:rPr>
-        <w:t xml:space="preserve">2-OH Estrone</w:t>
-      </w:r>
-      <w:r>
-        <w:rPr>
-          <w:rFonts w:ascii="Roboto" w:cs="Roboto" w:eastAsia="Roboto" w:hAnsi="Roboto"/>
-          <w:color w:val="000000"/>
-          <w:sz w:val="22"/>
-          <w:szCs w:val="22"/>
-        </w:rPr>
-        <w:t xml:space="preserve">   0.04 ug/gCR</w:t>
+        <w:t xml:space="preserve">Reverse T3</w:t>
+      </w:r>
+      <w:r>
+        <w:rPr>
+          <w:rFonts w:ascii="Roboto" w:cs="Roboto" w:eastAsia="Roboto" w:hAnsi="Roboto"/>
+          <w:color w:val="000000"/>
+          <w:sz w:val="22"/>
+          <w:szCs w:val="22"/>
+        </w:rPr>
+        <w:t xml:space="preserve">   449.6 pmol/L</w:t>
       </w:r>
       <w:r>
         <w:rPr>
@@ -1228,7 +1270,7 @@
           <w:sz w:val="20"/>
           <w:szCs w:val="20"/>
         </w:rPr>
-        <w:t xml:space="preserve">   (ref: 0.10–1.88 ug/gCR)</w:t>
+        <w:t xml:space="preserve">   (ref: 230.0–540.0 pmol/L)</w:t>
       </w:r>
     </w:p>
     <w:p>
@@ -1253,12 +1295,12 @@
           <w:sz w:val="20"/>
           <w:szCs w:val="20"/>
         </w:rPr>
-        <w:t xml:space="preserve">Below the laboratory reference framework — pattern consistent with reduced Phase I 2-hydroxylation of oestrone.</w:t>
-      </w:r>
-    </w:p>
-    <w:p>
-      <w:pPr>
-        <w:spacing w:after="60"/>
+        <w:t xml:space="preserve">Upper portion of reference range.</w:t>
+      </w:r>
+    </w:p>
+    <w:p>
+      <w:pPr>
+        <w:spacing w:after="60" w:before="120"/>
       </w:pPr>
       <w:r>
         <w:rPr>
@@ -1266,69 +1308,19 @@
           <w:b/>
           <w:bCs/>
           <w:color w:val="535B50"/>
-          <w:sz w:val="20"/>
-          <w:szCs w:val="20"/>
-        </w:rPr>
-        <w:t xml:space="preserve">Possible contributors: </w:t>
-      </w:r>
-      <w:r>
-        <w:rPr>
-          <w:rFonts w:ascii="Roboto" w:cs="Roboto" w:eastAsia="Roboto" w:hAnsi="Roboto"/>
-          <w:color w:val="000000"/>
-          <w:sz w:val="20"/>
-          <w:szCs w:val="20"/>
-        </w:rPr>
-        <w:t xml:space="preserve">Published literature identifies reduced CYP1A1 activity, inadequate cruciferous vegetable intake (DIM/I3C precursors), and Nrf2 pathway under-activation as factors that may contribute to low 2-OH metabolite output — practitioner to assess relevance.</w:t>
-      </w:r>
-    </w:p>
-    <w:p>
-      <w:pPr>
-        <w:spacing w:after="60"/>
-      </w:pPr>
-      <w:r>
-        <w:rPr>
-          <w:rFonts w:ascii="Roboto" w:cs="Roboto" w:eastAsia="Roboto" w:hAnsi="Roboto"/>
-          <w:b/>
-          <w:bCs/>
-          <w:color w:val="535B50"/>
-          <w:sz w:val="20"/>
-          <w:szCs w:val="20"/>
-        </w:rPr>
-        <w:t xml:space="preserve">Relevance to formulation: </w:t>
-      </w:r>
-      <w:r>
-        <w:rPr>
-          <w:rFonts w:ascii="Roboto" w:cs="Roboto" w:eastAsia="Roboto" w:hAnsi="Roboto"/>
-          <w:color w:val="000000"/>
-          <w:sz w:val="20"/>
-          <w:szCs w:val="20"/>
-        </w:rPr>
-        <w:t xml:space="preserve">Supports DIM inclusion as the canonical agent for shifting Phase I oestrogen hydroxylation toward the 2-OH pathway.</w:t>
-      </w:r>
-    </w:p>
-    <w:p>
-      <w:pPr>
-        <w:spacing w:after="60" w:before="120"/>
-      </w:pPr>
-      <w:r>
-        <w:rPr>
-          <w:rFonts w:ascii="Roboto" w:cs="Roboto" w:eastAsia="Roboto" w:hAnsi="Roboto"/>
-          <w:b/>
-          <w:bCs/>
-          <w:color w:val="535B50"/>
-          <w:sz w:val="22"/>
-          <w:szCs w:val="22"/>
-        </w:rPr>
-        <w:t xml:space="preserve">2-OH(E1+E2)/16-OHE1 ratio</w:t>
-      </w:r>
-      <w:r>
-        <w:rPr>
-          <w:rFonts w:ascii="Roboto" w:cs="Roboto" w:eastAsia="Roboto" w:hAnsi="Roboto"/>
-          <w:color w:val="000000"/>
-          <w:sz w:val="22"/>
-          <w:szCs w:val="22"/>
-        </w:rPr>
-        <w:t xml:space="preserve">   0.60</w:t>
+          <w:sz w:val="22"/>
+          <w:szCs w:val="22"/>
+        </w:rPr>
+        <w:t xml:space="preserve">Free T3</w:t>
+      </w:r>
+      <w:r>
+        <w:rPr>
+          <w:rFonts w:ascii="Roboto" w:cs="Roboto" w:eastAsia="Roboto" w:hAnsi="Roboto"/>
+          <w:color w:val="000000"/>
+          <w:sz w:val="22"/>
+          <w:szCs w:val="22"/>
+        </w:rPr>
+        <w:t xml:space="preserve">   3.5 pmol/L</w:t>
       </w:r>
       <w:r>
         <w:rPr>
@@ -1339,7 +1331,7 @@
           <w:sz w:val="20"/>
           <w:szCs w:val="20"/>
         </w:rPr>
-        <w:t xml:space="preserve">   (ref: 1.10–5.60)</w:t>
+        <w:t xml:space="preserve">   (ref: 3.1–6.8 pmol/L)</w:t>
       </w:r>
     </w:p>
     <w:p>
@@ -1364,12 +1356,12 @@
           <w:sz w:val="20"/>
           <w:szCs w:val="20"/>
         </w:rPr>
-        <w:t xml:space="preserve">Below the laboratory reference framework — pattern consistent with relative 16-OH predominance over the protective 2-OH pathway.</w:t>
-      </w:r>
-    </w:p>
-    <w:p>
-      <w:pPr>
-        <w:spacing w:after="60"/>
+        <w:t xml:space="preserve">Lower portion of reference range.</w:t>
+      </w:r>
+    </w:p>
+    <w:p>
+      <w:pPr>
+        <w:spacing w:after="60" w:before="120"/>
       </w:pPr>
       <w:r>
         <w:rPr>
@@ -1377,69 +1369,19 @@
           <w:b/>
           <w:bCs/>
           <w:color w:val="535B50"/>
-          <w:sz w:val="20"/>
-          <w:szCs w:val="20"/>
-        </w:rPr>
-        <w:t xml:space="preserve">Possible contributors: </w:t>
-      </w:r>
-      <w:r>
-        <w:rPr>
-          <w:rFonts w:ascii="Roboto" w:cs="Roboto" w:eastAsia="Roboto" w:hAnsi="Roboto"/>
-          <w:color w:val="000000"/>
-          <w:sz w:val="20"/>
-          <w:szCs w:val="20"/>
-        </w:rPr>
-        <w:t xml:space="preserve">Published literature identifies low cruciferous vegetable intake, inflammation, insulin dysregulation, and adiposity as factors that may contribute to a low 2:16 ratio — practitioner to assess relevance.</w:t>
-      </w:r>
-    </w:p>
-    <w:p>
-      <w:pPr>
-        <w:spacing w:after="60"/>
-      </w:pPr>
-      <w:r>
-        <w:rPr>
-          <w:rFonts w:ascii="Roboto" w:cs="Roboto" w:eastAsia="Roboto" w:hAnsi="Roboto"/>
-          <w:b/>
-          <w:bCs/>
-          <w:color w:val="535B50"/>
-          <w:sz w:val="20"/>
-          <w:szCs w:val="20"/>
-        </w:rPr>
-        <w:t xml:space="preserve">Relevance to formulation: </w:t>
-      </w:r>
-      <w:r>
-        <w:rPr>
-          <w:rFonts w:ascii="Roboto" w:cs="Roboto" w:eastAsia="Roboto" w:hAnsi="Roboto"/>
-          <w:color w:val="000000"/>
-          <w:sz w:val="20"/>
-          <w:szCs w:val="20"/>
-        </w:rPr>
-        <w:t xml:space="preserve">Reinforces hormone_metabolism axis priority — DIM, calcium D-glucarate, milk thistle, resveratrol for 2-OH pathway support and Phase II hepatic conjugation.</w:t>
-      </w:r>
-    </w:p>
-    <w:p>
-      <w:pPr>
-        <w:spacing w:after="60" w:before="120"/>
-      </w:pPr>
-      <w:r>
-        <w:rPr>
-          <w:rFonts w:ascii="Roboto" w:cs="Roboto" w:eastAsia="Roboto" w:hAnsi="Roboto"/>
-          <w:b/>
-          <w:bCs/>
-          <w:color w:val="535B50"/>
-          <w:sz w:val="22"/>
-          <w:szCs w:val="22"/>
-        </w:rPr>
-        <w:t xml:space="preserve">2-MeOH Estrone</w:t>
-      </w:r>
-      <w:r>
-        <w:rPr>
-          <w:rFonts w:ascii="Roboto" w:cs="Roboto" w:eastAsia="Roboto" w:hAnsi="Roboto"/>
-          <w:color w:val="000000"/>
-          <w:sz w:val="22"/>
-          <w:szCs w:val="22"/>
-        </w:rPr>
-        <w:t xml:space="preserve">   0.01 ug/gCR</w:t>
+          <w:sz w:val="22"/>
+          <w:szCs w:val="22"/>
+        </w:rPr>
+        <w:t xml:space="preserve">VLDL</w:t>
+      </w:r>
+      <w:r>
+        <w:rPr>
+          <w:rFonts w:ascii="Roboto" w:cs="Roboto" w:eastAsia="Roboto" w:hAnsi="Roboto"/>
+          <w:color w:val="000000"/>
+          <w:sz w:val="22"/>
+          <w:szCs w:val="22"/>
+        </w:rPr>
+        <w:t xml:space="preserve">   0.7 mmol/L</w:t>
       </w:r>
       <w:r>
         <w:rPr>
@@ -1450,7 +1392,7 @@
           <w:sz w:val="20"/>
           <w:szCs w:val="20"/>
         </w:rPr>
-        <w:t xml:space="preserve">   (ref: 0.02–0.20 ug/gCR)</w:t>
+        <w:t xml:space="preserve">   (ref: 0.1–0.6 mmol/L)</w:t>
       </w:r>
     </w:p>
     <w:p>
@@ -1475,7 +1417,7 @@
           <w:sz w:val="20"/>
           <w:szCs w:val="20"/>
         </w:rPr>
-        <w:t xml:space="preserve">Below the laboratory reference framework — interpretation in this case is dominated by the low 2-OH substrate (the COMT ratio 2-MeO-E1/2-OH-E1 of 0.30 is within reference 0.05–0.50), suggesting substrate availability rather than COMT capacity is the rate-limiting step.</w:t>
+        <w:t xml:space="preserve">Mildly elevated per laboratory reference framework.</w:t>
       </w:r>
     </w:p>
     <w:p>
@@ -1491,21 +1433,21 @@
           <w:sz w:val="20"/>
           <w:szCs w:val="20"/>
         </w:rPr>
-        <w:t xml:space="preserve">Possible contributors: </w:t>
-      </w:r>
-      <w:r>
-        <w:rPr>
-          <w:rFonts w:ascii="Roboto" w:cs="Roboto" w:eastAsia="Roboto" w:hAnsi="Roboto"/>
-          <w:color w:val="000000"/>
-          <w:sz w:val="20"/>
-          <w:szCs w:val="20"/>
-        </w:rPr>
-        <w:t xml:space="preserve">Published literature notes that 2-MeO output is dependent on adequate 2-OH substrate and COMT cofactors (magnesium, SAMe/methyl donors) — practitioner to assess relevance.</w:t>
-      </w:r>
-    </w:p>
-    <w:p>
-      <w:pPr>
-        <w:spacing w:after="60"/>
+        <w:t xml:space="preserve">Relevance to formulation: </w:t>
+      </w:r>
+      <w:r>
+        <w:rPr>
+          <w:rFonts w:ascii="Roboto" w:cs="Roboto" w:eastAsia="Roboto" w:hAnsi="Roboto"/>
+          <w:color w:val="000000"/>
+          <w:sz w:val="20"/>
+          <w:szCs w:val="20"/>
+        </w:rPr>
+        <w:t xml:space="preserve">Supports practitioner consideration of berberine and bergamot for lipid/metabolic pathway support.</w:t>
+      </w:r>
+    </w:p>
+    <w:p>
+      <w:pPr>
+        <w:spacing w:after="60" w:before="120"/>
       </w:pPr>
       <w:r>
         <w:rPr>
@@ -1513,44 +1455,19 @@
           <w:b/>
           <w:bCs/>
           <w:color w:val="535B50"/>
-          <w:sz w:val="20"/>
-          <w:szCs w:val="20"/>
-        </w:rPr>
-        <w:t xml:space="preserve">Relevance to formulation: </w:t>
-      </w:r>
-      <w:r>
-        <w:rPr>
-          <w:rFonts w:ascii="Roboto" w:cs="Roboto" w:eastAsia="Roboto" w:hAnsi="Roboto"/>
-          <w:color w:val="000000"/>
-          <w:sz w:val="20"/>
-          <w:szCs w:val="20"/>
-        </w:rPr>
-        <w:t xml:space="preserve">Supports inclusion of methylation cofactors (methylcobalamin, calcium folinate, P5P, riboflavin, magnesium glycinate) at meaningful doses, alongside DIM to provide 2-OH substrate.</w:t>
-      </w:r>
-    </w:p>
-    <w:p>
-      <w:pPr>
-        <w:spacing w:after="60" w:before="120"/>
-      </w:pPr>
-      <w:r>
-        <w:rPr>
-          <w:rFonts w:ascii="Roboto" w:cs="Roboto" w:eastAsia="Roboto" w:hAnsi="Roboto"/>
-          <w:b/>
-          <w:bCs/>
-          <w:color w:val="535B50"/>
-          <w:sz w:val="22"/>
-          <w:szCs w:val="22"/>
-        </w:rPr>
-        <w:t xml:space="preserve">2-MeOH Estradiol</w:t>
-      </w:r>
-      <w:r>
-        <w:rPr>
-          <w:rFonts w:ascii="Roboto" w:cs="Roboto" w:eastAsia="Roboto" w:hAnsi="Roboto"/>
-          <w:color w:val="000000"/>
-          <w:sz w:val="22"/>
-          <w:szCs w:val="22"/>
-        </w:rPr>
-        <w:t xml:space="preserve">   0.01 ug/gCR</w:t>
+          <w:sz w:val="22"/>
+          <w:szCs w:val="22"/>
+        </w:rPr>
+        <w:t xml:space="preserve">eGFR</w:t>
+      </w:r>
+      <w:r>
+        <w:rPr>
+          <w:rFonts w:ascii="Roboto" w:cs="Roboto" w:eastAsia="Roboto" w:hAnsi="Roboto"/>
+          <w:color w:val="000000"/>
+          <w:sz w:val="22"/>
+          <w:szCs w:val="22"/>
+        </w:rPr>
+        <w:t xml:space="preserve">   67 mL/min/1.73m²</w:t>
       </w:r>
       <w:r>
         <w:rPr>
@@ -1561,7 +1478,7 @@
           <w:sz w:val="20"/>
           <w:szCs w:val="20"/>
         </w:rPr>
-        <w:t xml:space="preserve">   (ref: 0.01–0.08 ug/gCR)</w:t>
+        <w:t xml:space="preserve">   (ref: &gt;90 mL/min/1.73m²)</w:t>
       </w:r>
     </w:p>
     <w:p>
@@ -1586,7 +1503,7 @@
           <w:sz w:val="20"/>
           <w:szCs w:val="20"/>
         </w:rPr>
-        <w:t xml:space="preserve">At the lower limit of the laboratory reference framework — pattern consistent with low downstream methylated metabolite, again reflecting low 2-OH substrate.</w:t>
+        <w:t xml:space="preserve">Mildly reduced — for practitioner clinical review. Not below the 30 mL/min/1.73m² threshold for refusal but warrants conservative dosing consideration and follow-up.</w:t>
       </w:r>
     </w:p>
     <w:p>
@@ -1602,21 +1519,21 @@
           <w:sz w:val="20"/>
           <w:szCs w:val="20"/>
         </w:rPr>
-        <w:t xml:space="preserve">Possible contributors: </w:t>
-      </w:r>
-      <w:r>
-        <w:rPr>
-          <w:rFonts w:ascii="Roboto" w:cs="Roboto" w:eastAsia="Roboto" w:hAnsi="Roboto"/>
-          <w:color w:val="000000"/>
-          <w:sz w:val="20"/>
-          <w:szCs w:val="20"/>
-        </w:rPr>
-        <w:t xml:space="preserve">Published literature: same as 2-MeOH Estrone above.</w:t>
-      </w:r>
-    </w:p>
-    <w:p>
-      <w:pPr>
-        <w:spacing w:after="60"/>
+        <w:t xml:space="preserve">Relevance to formulation: </w:t>
+      </w:r>
+      <w:r>
+        <w:rPr>
+          <w:rFonts w:ascii="Roboto" w:cs="Roboto" w:eastAsia="Roboto" w:hAnsi="Roboto"/>
+          <w:color w:val="000000"/>
+          <w:sz w:val="20"/>
+          <w:szCs w:val="20"/>
+        </w:rPr>
+        <w:t xml:space="preserve">Escalation flag raised; conservative dosing applied and standard renal-clearance cautions noted.</w:t>
+      </w:r>
+    </w:p>
+    <w:p>
+      <w:pPr>
+        <w:spacing w:after="60" w:before="120"/>
       </w:pPr>
       <w:r>
         <w:rPr>
@@ -1624,44 +1541,19 @@
           <w:b/>
           <w:bCs/>
           <w:color w:val="535B50"/>
-          <w:sz w:val="20"/>
-          <w:szCs w:val="20"/>
-        </w:rPr>
-        <w:t xml:space="preserve">Relevance to formulation: </w:t>
-      </w:r>
-      <w:r>
-        <w:rPr>
-          <w:rFonts w:ascii="Roboto" w:cs="Roboto" w:eastAsia="Roboto" w:hAnsi="Roboto"/>
-          <w:color w:val="000000"/>
-          <w:sz w:val="20"/>
-          <w:szCs w:val="20"/>
-        </w:rPr>
-        <w:t xml:space="preserve">Same as 2-MeOH Estrone — methylation cofactor and DIM support.</w:t>
-      </w:r>
-    </w:p>
-    <w:p>
-      <w:pPr>
-        <w:spacing w:after="60" w:before="120"/>
-      </w:pPr>
-      <w:r>
-        <w:rPr>
-          <w:rFonts w:ascii="Roboto" w:cs="Roboto" w:eastAsia="Roboto" w:hAnsi="Roboto"/>
-          <w:b/>
-          <w:bCs/>
-          <w:color w:val="535B50"/>
-          <w:sz w:val="22"/>
-          <w:szCs w:val="22"/>
-        </w:rPr>
-        <w:t xml:space="preserve">4-OH Estradiol</w:t>
-      </w:r>
-      <w:r>
-        <w:rPr>
-          <w:rFonts w:ascii="Roboto" w:cs="Roboto" w:eastAsia="Roboto" w:hAnsi="Roboto"/>
-          <w:color w:val="000000"/>
-          <w:sz w:val="22"/>
-          <w:szCs w:val="22"/>
-        </w:rPr>
-        <w:t xml:space="preserve">   &lt;DL ug/gCR</w:t>
+          <w:sz w:val="22"/>
+          <w:szCs w:val="22"/>
+        </w:rPr>
+        <w:t xml:space="preserve">Blood lead</w:t>
+      </w:r>
+      <w:r>
+        <w:rPr>
+          <w:rFonts w:ascii="Roboto" w:cs="Roboto" w:eastAsia="Roboto" w:hAnsi="Roboto"/>
+          <w:color w:val="000000"/>
+          <w:sz w:val="22"/>
+          <w:szCs w:val="22"/>
+        </w:rPr>
+        <w:t xml:space="preserve">   14.05 µg/L</w:t>
       </w:r>
       <w:r>
         <w:rPr>
@@ -1672,7 +1564,7 @@
           <w:sz w:val="20"/>
           <w:szCs w:val="20"/>
         </w:rPr>
-        <w:t xml:space="preserve">   (ref: 0.02–0.25 ug/gCR)</w:t>
+        <w:t xml:space="preserve">   (ref: 0.00–50.00 µg/L)</w:t>
       </w:r>
     </w:p>
     <w:p>
@@ -1697,12 +1589,12 @@
           <w:sz w:val="20"/>
           <w:szCs w:val="20"/>
         </w:rPr>
-        <w:t xml:space="preserve">Below detection — consistent with low genotoxic 4-OH metabolite output, generally a favourable pattern per the laboratory framework.</w:t>
-      </w:r>
-    </w:p>
-    <w:p>
-      <w:pPr>
-        <w:spacing w:after="60"/>
+        <w:t xml:space="preserve">Within laboratory reference but detectable — for practitioner consideration in the context of the toxicant-burdened pattern.</w:t>
+      </w:r>
+    </w:p>
+    <w:p>
+      <w:pPr>
+        <w:spacing w:after="60" w:before="120"/>
       </w:pPr>
       <w:r>
         <w:rPr>
@@ -1710,69 +1602,19 @@
           <w:b/>
           <w:bCs/>
           <w:color w:val="535B50"/>
-          <w:sz w:val="20"/>
-          <w:szCs w:val="20"/>
-        </w:rPr>
-        <w:t xml:space="preserve">Possible contributors: </w:t>
-      </w:r>
-      <w:r>
-        <w:rPr>
-          <w:rFonts w:ascii="Roboto" w:cs="Roboto" w:eastAsia="Roboto" w:hAnsi="Roboto"/>
-          <w:color w:val="000000"/>
-          <w:sz w:val="20"/>
-          <w:szCs w:val="20"/>
-        </w:rPr>
-        <w:t xml:space="preserve">Published literature notes that 4-OH metabolites reflect CYP1B1 activity; low values are generally considered protective relative to high values.</w:t>
-      </w:r>
-    </w:p>
-    <w:p>
-      <w:pPr>
-        <w:spacing w:after="60"/>
-      </w:pPr>
-      <w:r>
-        <w:rPr>
-          <w:rFonts w:ascii="Roboto" w:cs="Roboto" w:eastAsia="Roboto" w:hAnsi="Roboto"/>
-          <w:b/>
-          <w:bCs/>
-          <w:color w:val="535B50"/>
-          <w:sz w:val="20"/>
-          <w:szCs w:val="20"/>
-        </w:rPr>
-        <w:t xml:space="preserve">Relevance to formulation: </w:t>
-      </w:r>
-      <w:r>
-        <w:rPr>
-          <w:rFonts w:ascii="Roboto" w:cs="Roboto" w:eastAsia="Roboto" w:hAnsi="Roboto"/>
-          <w:color w:val="000000"/>
-          <w:sz w:val="20"/>
-          <w:szCs w:val="20"/>
-        </w:rPr>
-        <w:t xml:space="preserve">Does not drive specific stack additions; NAC and quercetin (included for other reasons) provide quinone-quenching capacity if 4-OH output rises.</w:t>
-      </w:r>
-    </w:p>
-    <w:p>
-      <w:pPr>
-        <w:spacing w:after="60" w:before="120"/>
-      </w:pPr>
-      <w:r>
-        <w:rPr>
-          <w:rFonts w:ascii="Roboto" w:cs="Roboto" w:eastAsia="Roboto" w:hAnsi="Roboto"/>
-          <w:b/>
-          <w:bCs/>
-          <w:color w:val="535B50"/>
-          <w:sz w:val="22"/>
-          <w:szCs w:val="22"/>
-        </w:rPr>
-        <w:t xml:space="preserve">4-OH Estrone</w:t>
-      </w:r>
-      <w:r>
-        <w:rPr>
-          <w:rFonts w:ascii="Roboto" w:cs="Roboto" w:eastAsia="Roboto" w:hAnsi="Roboto"/>
-          <w:color w:val="000000"/>
-          <w:sz w:val="22"/>
-          <w:szCs w:val="22"/>
-        </w:rPr>
-        <w:t xml:space="preserve">   0.03 ug/gCR</w:t>
+          <w:sz w:val="22"/>
+          <w:szCs w:val="22"/>
+        </w:rPr>
+        <w:t xml:space="preserve">Blood aluminium</w:t>
+      </w:r>
+      <w:r>
+        <w:rPr>
+          <w:rFonts w:ascii="Roboto" w:cs="Roboto" w:eastAsia="Roboto" w:hAnsi="Roboto"/>
+          <w:color w:val="000000"/>
+          <w:sz w:val="22"/>
+          <w:szCs w:val="22"/>
+        </w:rPr>
+        <w:t xml:space="preserve">   28.13 µg/L</w:t>
       </w:r>
       <w:r>
         <w:rPr>
@@ -1783,7 +1625,7 @@
           <w:sz w:val="20"/>
           <w:szCs w:val="20"/>
         </w:rPr>
-        <w:t xml:space="preserve">   (ref: 0.03–0.30 ug/gCR)</w:t>
+        <w:t xml:space="preserve">   (ref: 0.00–30.00 µg/L)</w:t>
       </w:r>
     </w:p>
     <w:p>
@@ -1808,12 +1650,12 @@
           <w:sz w:val="20"/>
           <w:szCs w:val="20"/>
         </w:rPr>
-        <w:t xml:space="preserve">At the lower limit of the laboratory reference framework — favourable pattern per laboratory comment.</w:t>
-      </w:r>
-    </w:p>
-    <w:p>
-      <w:pPr>
-        <w:spacing w:after="60"/>
+        <w:t xml:space="preserve">Upper end of reference — for practitioner consideration.</w:t>
+      </w:r>
+    </w:p>
+    <w:p>
+      <w:pPr>
+        <w:spacing w:after="60" w:before="120"/>
       </w:pPr>
       <w:r>
         <w:rPr>
@@ -1821,69 +1663,19 @@
           <w:b/>
           <w:bCs/>
           <w:color w:val="535B50"/>
-          <w:sz w:val="20"/>
-          <w:szCs w:val="20"/>
-        </w:rPr>
-        <w:t xml:space="preserve">Possible contributors: </w:t>
-      </w:r>
-      <w:r>
-        <w:rPr>
-          <w:rFonts w:ascii="Roboto" w:cs="Roboto" w:eastAsia="Roboto" w:hAnsi="Roboto"/>
-          <w:color w:val="000000"/>
-          <w:sz w:val="20"/>
-          <w:szCs w:val="20"/>
-        </w:rPr>
-        <w:t xml:space="preserve">Same as 4-OH Estradiol above.</w:t>
-      </w:r>
-    </w:p>
-    <w:p>
-      <w:pPr>
-        <w:spacing w:after="60"/>
-      </w:pPr>
-      <w:r>
-        <w:rPr>
-          <w:rFonts w:ascii="Roboto" w:cs="Roboto" w:eastAsia="Roboto" w:hAnsi="Roboto"/>
-          <w:b/>
-          <w:bCs/>
-          <w:color w:val="535B50"/>
-          <w:sz w:val="20"/>
-          <w:szCs w:val="20"/>
-        </w:rPr>
-        <w:t xml:space="preserve">Relevance to formulation: </w:t>
-      </w:r>
-      <w:r>
-        <w:rPr>
-          <w:rFonts w:ascii="Roboto" w:cs="Roboto" w:eastAsia="Roboto" w:hAnsi="Roboto"/>
-          <w:color w:val="000000"/>
-          <w:sz w:val="20"/>
-          <w:szCs w:val="20"/>
-        </w:rPr>
-        <w:t xml:space="preserve">Not a primary driver of formulation.</w:t>
-      </w:r>
-    </w:p>
-    <w:p>
-      <w:pPr>
-        <w:spacing w:after="60" w:before="120"/>
-      </w:pPr>
-      <w:r>
-        <w:rPr>
-          <w:rFonts w:ascii="Roboto" w:cs="Roboto" w:eastAsia="Roboto" w:hAnsi="Roboto"/>
-          <w:b/>
-          <w:bCs/>
-          <w:color w:val="535B50"/>
-          <w:sz w:val="22"/>
-          <w:szCs w:val="22"/>
-        </w:rPr>
-        <w:t xml:space="preserve">4-MeOH E2/4-OH E2 ratio</w:t>
-      </w:r>
-      <w:r>
-        <w:rPr>
-          <w:rFonts w:ascii="Roboto" w:cs="Roboto" w:eastAsia="Roboto" w:hAnsi="Roboto"/>
-          <w:color w:val="000000"/>
-          <w:sz w:val="22"/>
-          <w:szCs w:val="22"/>
-        </w:rPr>
-        <w:t xml:space="preserve">   4.39</w:t>
+          <w:sz w:val="22"/>
+          <w:szCs w:val="22"/>
+        </w:rPr>
+        <w:t xml:space="preserve">Copper:Zinc ratio</w:t>
+      </w:r>
+      <w:r>
+        <w:rPr>
+          <w:rFonts w:ascii="Roboto" w:cs="Roboto" w:eastAsia="Roboto" w:hAnsi="Roboto"/>
+          <w:color w:val="000000"/>
+          <w:sz w:val="22"/>
+          <w:szCs w:val="22"/>
+        </w:rPr>
+        <w:t xml:space="preserve">   1.50</w:t>
       </w:r>
       <w:r>
         <w:rPr>
@@ -1894,7 +1686,7 @@
           <w:sz w:val="20"/>
           <w:szCs w:val="20"/>
         </w:rPr>
-        <w:t xml:space="preserve">   (ref: 0.06–1.03)</w:t>
+        <w:t xml:space="preserve">   (ref: 0.54–1.68)</w:t>
       </w:r>
     </w:p>
     <w:p>
@@ -1919,7 +1711,7 @@
           <w:sz w:val="20"/>
           <w:szCs w:val="20"/>
         </w:rPr>
-        <w:t xml:space="preserve">Above the laboratory reference framework — the laboratory comment characterises this as reflecting efficient methylation of 4-OH metabolites, a generally favourable pattern.</w:t>
+        <w:t xml:space="preserve">At upper reference limit per laboratory framework. Combined with plasma zinc in lower portion of reference (9.9 µmol/L, range 9.0–19.0), pattern suggests practitioner may wish to prioritise zinc repletion.</w:t>
       </w:r>
     </w:p>
     <w:p>
@@ -1935,21 +1727,21 @@
           <w:sz w:val="20"/>
           <w:szCs w:val="20"/>
         </w:rPr>
-        <w:t xml:space="preserve">Possible contributors: </w:t>
-      </w:r>
-      <w:r>
-        <w:rPr>
-          <w:rFonts w:ascii="Roboto" w:cs="Roboto" w:eastAsia="Roboto" w:hAnsi="Roboto"/>
-          <w:color w:val="000000"/>
-          <w:sz w:val="20"/>
-          <w:szCs w:val="20"/>
-        </w:rPr>
-        <w:t xml:space="preserve">Published literature notes that elevated methylated/hydroxylated ratios suggest active COMT-mediated detoxification of catechol oestrogens.</w:t>
-      </w:r>
-    </w:p>
-    <w:p>
-      <w:pPr>
-        <w:spacing w:after="60"/>
+        <w:t xml:space="preserve">Relevance to formulation: </w:t>
+      </w:r>
+      <w:r>
+        <w:rPr>
+          <w:rFonts w:ascii="Roboto" w:cs="Roboto" w:eastAsia="Roboto" w:hAnsi="Roboto"/>
+          <w:color w:val="000000"/>
+          <w:sz w:val="20"/>
+          <w:szCs w:val="20"/>
+        </w:rPr>
+        <w:t xml:space="preserve">Copper is excluded as a binding exclusion (Cu:Zn ratio at/above 1.50). Zinc citrate included at moderate dose to support the ratio.</w:t>
+      </w:r>
+    </w:p>
+    <w:p>
+      <w:pPr>
+        <w:spacing w:after="60" w:before="120"/>
       </w:pPr>
       <w:r>
         <w:rPr>
@@ -1957,44 +1749,19 @@
           <w:b/>
           <w:bCs/>
           <w:color w:val="535B50"/>
-          <w:sz w:val="20"/>
-          <w:szCs w:val="20"/>
-        </w:rPr>
-        <w:t xml:space="preserve">Relevance to formulation: </w:t>
-      </w:r>
-      <w:r>
-        <w:rPr>
-          <w:rFonts w:ascii="Roboto" w:cs="Roboto" w:eastAsia="Roboto" w:hAnsi="Roboto"/>
-          <w:color w:val="000000"/>
-          <w:sz w:val="20"/>
-          <w:szCs w:val="20"/>
-        </w:rPr>
-        <w:t xml:space="preserve">Suggests COMT methylation capacity for the 4-OH branch is preserved; does not contraindicate methylation cofactor support given 2-OH branch substrate is the limiting factor.</w:t>
-      </w:r>
-    </w:p>
-    <w:p>
-      <w:pPr>
-        <w:spacing w:after="60" w:before="120"/>
-      </w:pPr>
-      <w:r>
-        <w:rPr>
-          <w:rFonts w:ascii="Roboto" w:cs="Roboto" w:eastAsia="Roboto" w:hAnsi="Roboto"/>
-          <w:b/>
-          <w:bCs/>
-          <w:color w:val="535B50"/>
-          <w:sz w:val="22"/>
-          <w:szCs w:val="22"/>
-        </w:rPr>
-        <w:t xml:space="preserve">Testosterone</w:t>
-      </w:r>
-      <w:r>
-        <w:rPr>
-          <w:rFonts w:ascii="Roboto" w:cs="Roboto" w:eastAsia="Roboto" w:hAnsi="Roboto"/>
-          <w:color w:val="000000"/>
-          <w:sz w:val="22"/>
-          <w:szCs w:val="22"/>
-        </w:rPr>
-        <w:t xml:space="preserve">   15.38 ug/gCR</w:t>
+          <w:sz w:val="22"/>
+          <w:szCs w:val="22"/>
+        </w:rPr>
+        <w:t xml:space="preserve">Red cell selenium</w:t>
+      </w:r>
+      <w:r>
+        <w:rPr>
+          <w:rFonts w:ascii="Roboto" w:cs="Roboto" w:eastAsia="Roboto" w:hAnsi="Roboto"/>
+          <w:color w:val="000000"/>
+          <w:sz w:val="22"/>
+          <w:szCs w:val="22"/>
+        </w:rPr>
+        <w:t xml:space="preserve">   498.9 µg/L</w:t>
       </w:r>
       <w:r>
         <w:rPr>
@@ -2005,7 +1772,7 @@
           <w:sz w:val="20"/>
           <w:szCs w:val="20"/>
         </w:rPr>
-        <w:t xml:space="preserve">   (ref: 2.50–25.00 ug/gCR)</w:t>
+        <w:t xml:space="preserve">   (ref: 190.0–500.0 µg/L)</w:t>
       </w:r>
     </w:p>
     <w:p>
@@ -2030,7 +1797,7 @@
           <w:sz w:val="20"/>
           <w:szCs w:val="20"/>
         </w:rPr>
-        <w:t xml:space="preserve">Within laboratory reference framework, upper-middle of range.</w:t>
+        <w:t xml:space="preserve">At the upper reference limit (99.8% of upper limit) per laboratory framework.</w:t>
       </w:r>
     </w:p>
     <w:p>
@@ -2046,21 +1813,21 @@
           <w:sz w:val="20"/>
           <w:szCs w:val="20"/>
         </w:rPr>
-        <w:t xml:space="preserve">Possible contributors: </w:t>
-      </w:r>
-      <w:r>
-        <w:rPr>
-          <w:rFonts w:ascii="Roboto" w:cs="Roboto" w:eastAsia="Roboto" w:hAnsi="Roboto"/>
-          <w:color w:val="000000"/>
-          <w:sz w:val="20"/>
-          <w:szCs w:val="20"/>
-        </w:rPr>
-        <w:t xml:space="preserve">Not flagged.</w:t>
-      </w:r>
-    </w:p>
-    <w:p>
-      <w:pPr>
-        <w:spacing w:after="60"/>
+        <w:t xml:space="preserve">Relevance to formulation: </w:t>
+      </w:r>
+      <w:r>
+        <w:rPr>
+          <w:rFonts w:ascii="Roboto" w:cs="Roboto" w:eastAsia="Roboto" w:hAnsi="Roboto"/>
+          <w:color w:val="000000"/>
+          <w:sz w:val="20"/>
+          <w:szCs w:val="20"/>
+        </w:rPr>
+        <w:t xml:space="preserve">Selenium is excluded as a binding exclusion (RBC selenium at ≥90% of upper reference limit).</w:t>
+      </w:r>
+    </w:p>
+    <w:p>
+      <w:pPr>
+        <w:spacing w:after="60" w:before="120"/>
       </w:pPr>
       <w:r>
         <w:rPr>
@@ -2068,44 +1835,19 @@
           <w:b/>
           <w:bCs/>
           <w:color w:val="535B50"/>
-          <w:sz w:val="20"/>
-          <w:szCs w:val="20"/>
-        </w:rPr>
-        <w:t xml:space="preserve">Relevance to formulation: </w:t>
-      </w:r>
-      <w:r>
-        <w:rPr>
-          <w:rFonts w:ascii="Roboto" w:cs="Roboto" w:eastAsia="Roboto" w:hAnsi="Roboto"/>
-          <w:color w:val="000000"/>
-          <w:sz w:val="20"/>
-          <w:szCs w:val="20"/>
-        </w:rPr>
-        <w:t xml:space="preserve">Does not drive androgen-specific inclusions; supports moderate (not high) zinc dosing rather than maximal 5-alpha-reductase suppression.</w:t>
-      </w:r>
-    </w:p>
-    <w:p>
-      <w:pPr>
-        <w:spacing w:after="60" w:before="120"/>
-      </w:pPr>
-      <w:r>
-        <w:rPr>
-          <w:rFonts w:ascii="Roboto" w:cs="Roboto" w:eastAsia="Roboto" w:hAnsi="Roboto"/>
-          <w:b/>
-          <w:bCs/>
-          <w:color w:val="535B50"/>
-          <w:sz w:val="22"/>
-          <w:szCs w:val="22"/>
-        </w:rPr>
-        <w:t xml:space="preserve">DHEA</w:t>
-      </w:r>
-      <w:r>
-        <w:rPr>
-          <w:rFonts w:ascii="Roboto" w:cs="Roboto" w:eastAsia="Roboto" w:hAnsi="Roboto"/>
-          <w:color w:val="000000"/>
-          <w:sz w:val="22"/>
-          <w:szCs w:val="22"/>
-        </w:rPr>
-        <w:t xml:space="preserve">   16.27 ug/gCR</w:t>
+          <w:sz w:val="22"/>
+          <w:szCs w:val="22"/>
+        </w:rPr>
+        <w:t xml:space="preserve">Ferritin</w:t>
+      </w:r>
+      <w:r>
+        <w:rPr>
+          <w:rFonts w:ascii="Roboto" w:cs="Roboto" w:eastAsia="Roboto" w:hAnsi="Roboto"/>
+          <w:color w:val="000000"/>
+          <w:sz w:val="22"/>
+          <w:szCs w:val="22"/>
+        </w:rPr>
+        <w:t xml:space="preserve">   243 µg/L</w:t>
       </w:r>
       <w:r>
         <w:rPr>
@@ -2116,7 +1858,7 @@
           <w:sz w:val="20"/>
           <w:szCs w:val="20"/>
         </w:rPr>
-        <w:t xml:space="preserve">   (ref: 9.00–105.00 ug/gCR)</w:t>
+        <w:t xml:space="preserve">   (ref: 30–300 µg/L)</w:t>
       </w:r>
     </w:p>
     <w:p>
@@ -2141,12 +1883,12 @@
           <w:sz w:val="20"/>
           <w:szCs w:val="20"/>
         </w:rPr>
-        <w:t xml:space="preserve">Within reference, lower portion of range — alongside low cortisol, pattern consistent with reduced overall adrenal steroidogenic output.</w:t>
-      </w:r>
-    </w:p>
-    <w:p>
-      <w:pPr>
-        <w:spacing w:after="60"/>
+        <w:t xml:space="preserve">Upper portion of reference; combined with transferrin saturation 32%, no indication for iron supplementation.</w:t>
+      </w:r>
+    </w:p>
+    <w:p>
+      <w:pPr>
+        <w:spacing w:after="60" w:before="120"/>
       </w:pPr>
       <w:r>
         <w:rPr>
@@ -2154,69 +1896,19 @@
           <w:b/>
           <w:bCs/>
           <w:color w:val="535B50"/>
-          <w:sz w:val="20"/>
-          <w:szCs w:val="20"/>
-        </w:rPr>
-        <w:t xml:space="preserve">Possible contributors: </w:t>
-      </w:r>
-      <w:r>
-        <w:rPr>
-          <w:rFonts w:ascii="Roboto" w:cs="Roboto" w:eastAsia="Roboto" w:hAnsi="Roboto"/>
-          <w:color w:val="000000"/>
-          <w:sz w:val="20"/>
-          <w:szCs w:val="20"/>
-        </w:rPr>
-        <w:t xml:space="preserve">Published literature identifies HPA suppression as a contributor to reduced DHEA in conjunction with reduced cortisol.</w:t>
-      </w:r>
-    </w:p>
-    <w:p>
-      <w:pPr>
-        <w:spacing w:after="60"/>
-      </w:pPr>
-      <w:r>
-        <w:rPr>
-          <w:rFonts w:ascii="Roboto" w:cs="Roboto" w:eastAsia="Roboto" w:hAnsi="Roboto"/>
-          <w:b/>
-          <w:bCs/>
-          <w:color w:val="535B50"/>
-          <w:sz w:val="20"/>
-          <w:szCs w:val="20"/>
-        </w:rPr>
-        <w:t xml:space="preserve">Relevance to formulation: </w:t>
-      </w:r>
-      <w:r>
-        <w:rPr>
-          <w:rFonts w:ascii="Roboto" w:cs="Roboto" w:eastAsia="Roboto" w:hAnsi="Roboto"/>
-          <w:color w:val="000000"/>
-          <w:sz w:val="20"/>
-          <w:szCs w:val="20"/>
-        </w:rPr>
-        <w:t xml:space="preserve">Reinforces adaptogenic axis priority.</w:t>
-      </w:r>
-    </w:p>
-    <w:p>
-      <w:pPr>
-        <w:spacing w:after="60" w:before="120"/>
-      </w:pPr>
-      <w:r>
-        <w:rPr>
-          <w:rFonts w:ascii="Roboto" w:cs="Roboto" w:eastAsia="Roboto" w:hAnsi="Roboto"/>
-          <w:b/>
-          <w:bCs/>
-          <w:color w:val="535B50"/>
-          <w:sz w:val="22"/>
-          <w:szCs w:val="22"/>
-        </w:rPr>
-        <w:t xml:space="preserve">Pregnanediol</w:t>
-      </w:r>
-      <w:r>
-        <w:rPr>
-          <w:rFonts w:ascii="Roboto" w:cs="Roboto" w:eastAsia="Roboto" w:hAnsi="Roboto"/>
-          <w:color w:val="000000"/>
-          <w:sz w:val="22"/>
-          <w:szCs w:val="22"/>
-        </w:rPr>
-        <w:t xml:space="preserve">   36 ug/gCR</w:t>
+          <w:sz w:val="22"/>
+          <w:szCs w:val="22"/>
+        </w:rPr>
+        <w:t xml:space="preserve">Anion gap</w:t>
+      </w:r>
+      <w:r>
+        <w:rPr>
+          <w:rFonts w:ascii="Roboto" w:cs="Roboto" w:eastAsia="Roboto" w:hAnsi="Roboto"/>
+          <w:color w:val="000000"/>
+          <w:sz w:val="22"/>
+          <w:szCs w:val="22"/>
+        </w:rPr>
+        <w:t xml:space="preserve">   18 mmol/L</w:t>
       </w:r>
       <w:r>
         <w:rPr>
@@ -2227,7 +1919,7 @@
           <w:sz w:val="20"/>
           <w:szCs w:val="20"/>
         </w:rPr>
-        <w:t xml:space="preserve">   (ref: 25–150 ug/gCR)</w:t>
+        <w:t xml:space="preserve">   (ref: 8–16 mmol/L)</w:t>
       </w:r>
     </w:p>
     <w:p>
@@ -2252,12 +1944,12 @@
           <w:sz w:val="20"/>
           <w:szCs w:val="20"/>
         </w:rPr>
-        <w:t xml:space="preserve">Within reference, lower portion of range — not flagged.</w:t>
-      </w:r>
-    </w:p>
-    <w:p>
-      <w:pPr>
-        <w:spacing w:after="60"/>
+        <w:t xml:space="preserve">Mildly elevated — for practitioner clinical review.</w:t>
+      </w:r>
+    </w:p>
+    <w:p>
+      <w:pPr>
+        <w:spacing w:after="60" w:before="120"/>
       </w:pPr>
       <w:r>
         <w:rPr>
@@ -2265,69 +1957,19 @@
           <w:b/>
           <w:bCs/>
           <w:color w:val="535B50"/>
-          <w:sz w:val="20"/>
-          <w:szCs w:val="20"/>
-        </w:rPr>
-        <w:t xml:space="preserve">Possible contributors: </w:t>
-      </w:r>
-      <w:r>
-        <w:rPr>
-          <w:rFonts w:ascii="Roboto" w:cs="Roboto" w:eastAsia="Roboto" w:hAnsi="Roboto"/>
-          <w:color w:val="000000"/>
-          <w:sz w:val="20"/>
-          <w:szCs w:val="20"/>
-        </w:rPr>
-        <w:t xml:space="preserve">Not relevant to formulation here.</w:t>
-      </w:r>
-    </w:p>
-    <w:p>
-      <w:pPr>
-        <w:spacing w:after="60"/>
-      </w:pPr>
-      <w:r>
-        <w:rPr>
-          <w:rFonts w:ascii="Roboto" w:cs="Roboto" w:eastAsia="Roboto" w:hAnsi="Roboto"/>
-          <w:b/>
-          <w:bCs/>
-          <w:color w:val="535B50"/>
-          <w:sz w:val="20"/>
-          <w:szCs w:val="20"/>
-        </w:rPr>
-        <w:t xml:space="preserve">Relevance to formulation: </w:t>
-      </w:r>
-      <w:r>
-        <w:rPr>
-          <w:rFonts w:ascii="Roboto" w:cs="Roboto" w:eastAsia="Roboto" w:hAnsi="Roboto"/>
-          <w:color w:val="000000"/>
-          <w:sz w:val="20"/>
-          <w:szCs w:val="20"/>
-        </w:rPr>
-        <w:t xml:space="preserve">No specific addition; not a driver in male physiology of this pattern.</w:t>
-      </w:r>
-    </w:p>
-    <w:p>
-      <w:pPr>
-        <w:spacing w:after="60" w:before="120"/>
-      </w:pPr>
-      <w:r>
-        <w:rPr>
-          <w:rFonts w:ascii="Roboto" w:cs="Roboto" w:eastAsia="Roboto" w:hAnsi="Roboto"/>
-          <w:b/>
-          <w:bCs/>
-          <w:color w:val="535B50"/>
-          <w:sz w:val="22"/>
-          <w:szCs w:val="22"/>
-        </w:rPr>
-        <w:t xml:space="preserve">Endocrine disruptor panel (BPA, PFAS, PFOA, PFOS, Al, As, Cd, Cr, Pb, Hg, Ni)</w:t>
-      </w:r>
-      <w:r>
-        <w:rPr>
-          <w:rFonts w:ascii="Roboto" w:cs="Roboto" w:eastAsia="Roboto" w:hAnsi="Roboto"/>
-          <w:color w:val="000000"/>
-          <w:sz w:val="22"/>
-          <w:szCs w:val="22"/>
-        </w:rPr>
-        <w:t xml:space="preserve">   All below or near detection limits within reference</w:t>
+          <w:sz w:val="22"/>
+          <w:szCs w:val="22"/>
+        </w:rPr>
+        <w:t xml:space="preserve">Fibrinogen</w:t>
+      </w:r>
+      <w:r>
+        <w:rPr>
+          <w:rFonts w:ascii="Roboto" w:cs="Roboto" w:eastAsia="Roboto" w:hAnsi="Roboto"/>
+          <w:color w:val="000000"/>
+          <w:sz w:val="22"/>
+          <w:szCs w:val="22"/>
+        </w:rPr>
+        <w:t xml:space="preserve">   4.5 g/L</w:t>
       </w:r>
       <w:r>
         <w:rPr>
@@ -2338,7 +1980,7 @@
           <w:sz w:val="20"/>
           <w:szCs w:val="20"/>
         </w:rPr>
-        <w:t xml:space="preserve">   (ref: Per laboratory framework)</w:t>
+        <w:t xml:space="preserve">   (ref: 2.0–4.5 g/L)</w:t>
       </w:r>
     </w:p>
     <w:p>
@@ -2363,12 +2005,12 @@
           <w:sz w:val="20"/>
           <w:szCs w:val="20"/>
         </w:rPr>
-        <w:t xml:space="preserve">No evidence of significant environmental exposure burden on this panel — favourable.</w:t>
-      </w:r>
-    </w:p>
-    <w:p>
-      <w:pPr>
-        <w:spacing w:after="60"/>
+        <w:t xml:space="preserve">Upper reference limit — supports the inflammatory-metabolic pattern.</w:t>
+      </w:r>
+    </w:p>
+    <w:p>
+      <w:pPr>
+        <w:spacing w:after="60" w:before="120"/>
       </w:pPr>
       <w:r>
         <w:rPr>
@@ -2376,19 +2018,30 @@
           <w:b/>
           <w:bCs/>
           <w:color w:val="535B50"/>
-          <w:sz w:val="20"/>
-          <w:szCs w:val="20"/>
-        </w:rPr>
-        <w:t xml:space="preserve">Possible contributors: </w:t>
-      </w:r>
-      <w:r>
-        <w:rPr>
-          <w:rFonts w:ascii="Roboto" w:cs="Roboto" w:eastAsia="Roboto" w:hAnsi="Roboto"/>
-          <w:color w:val="000000"/>
-          <w:sz w:val="20"/>
-          <w:szCs w:val="20"/>
-        </w:rPr>
-        <w:t xml:space="preserve">Not applicable.</w:t>
+          <w:sz w:val="22"/>
+          <w:szCs w:val="22"/>
+        </w:rPr>
+        <w:t xml:space="preserve">25-OH Vitamin D</w:t>
+      </w:r>
+      <w:r>
+        <w:rPr>
+          <w:rFonts w:ascii="Roboto" w:cs="Roboto" w:eastAsia="Roboto" w:hAnsi="Roboto"/>
+          <w:color w:val="000000"/>
+          <w:sz w:val="22"/>
+          <w:szCs w:val="22"/>
+        </w:rPr>
+        <w:t xml:space="preserve">   69 nmol/L</w:t>
+      </w:r>
+      <w:r>
+        <w:rPr>
+          <w:rFonts w:ascii="Roboto" w:cs="Roboto" w:eastAsia="Roboto" w:hAnsi="Roboto"/>
+          <w:i/>
+          <w:iCs/>
+          <w:color w:val="666666"/>
+          <w:sz w:val="20"/>
+          <w:szCs w:val="20"/>
+        </w:rPr>
+        <w:t xml:space="preserve">   (ref: 50–200 nmol/L)</w:t>
       </w:r>
     </w:p>
     <w:p>
@@ -2404,16 +2057,16 @@
           <w:sz w:val="20"/>
           <w:szCs w:val="20"/>
         </w:rPr>
-        <w:t xml:space="preserve">Relevance to formulation: </w:t>
-      </w:r>
-      <w:r>
-        <w:rPr>
-          <w:rFonts w:ascii="Roboto" w:cs="Roboto" w:eastAsia="Roboto" w:hAnsi="Roboto"/>
-          <w:color w:val="000000"/>
-          <w:sz w:val="20"/>
-          <w:szCs w:val="20"/>
-        </w:rPr>
-        <w:t xml:space="preserve">No heavy_metal_detox axis prioritisation required; antioxidant_redox axis remains relevant for general oestrogen-metabolism support.</w:t>
+        <w:t xml:space="preserve">Interpretation: </w:t>
+      </w:r>
+      <w:r>
+        <w:rPr>
+          <w:rFonts w:ascii="Roboto" w:cs="Roboto" w:eastAsia="Roboto" w:hAnsi="Roboto"/>
+          <w:color w:val="000000"/>
+          <w:sz w:val="20"/>
+          <w:szCs w:val="20"/>
+        </w:rPr>
+        <w:t xml:space="preserve">Mid-lower range; modest supplementation may be considered.</w:t>
       </w:r>
     </w:p>
     <w:p>
@@ -2464,7 +2117,7 @@
           <w:sz w:val="22"/>
           <w:szCs w:val="22"/>
         </w:rPr>
-        <w:t xml:space="preserve">Cruciferous vegetables</w:t>
+        <w:t xml:space="preserve">Anti-inflammatory dietary pattern</w:t>
       </w:r>
     </w:p>
     <w:p>
@@ -2489,7 +2142,7 @@
           <w:sz w:val="20"/>
           <w:szCs w:val="20"/>
         </w:rPr>
-        <w:t xml:space="preserve">The practitioner may wish to discuss with the patient regular intake of cruciferous vegetables (broccoli, broccoli sprouts, brussels sprouts, cabbage, cauliflower) as dietary sources of indole-3-carbinol and DIM precursors — published literature supports cruciferous intake for 2-OH pathway support.</w:t>
+        <w:t xml:space="preserve">Given the elevated hsCRP and mildly elevated VLDL, the practitioner may wish to discuss a Mediterranean-style eating pattern rich in polyphenols, oily fish (for omega-3), and reduced ultra-processed carbohydrate load.</w:t>
       </w:r>
     </w:p>
     <w:p>
@@ -2514,7 +2167,7 @@
           <w:sz w:val="20"/>
           <w:szCs w:val="20"/>
         </w:rPr>
-        <w:t xml:space="preserve">Low 2-OH Estrone and low 2:16 ratio suggest practitioner consideration of dietary support for the 2-hydroxylation pathway.</w:t>
+        <w:t xml:space="preserve">Supports the inflammatory-metabolic pattern identified on the panel.</w:t>
       </w:r>
     </w:p>
     <w:p>
@@ -2530,7 +2183,7 @@
           <w:sz w:val="22"/>
           <w:szCs w:val="22"/>
         </w:rPr>
-        <w:t xml:space="preserve">Stress / HPA-axis support</w:t>
+        <w:t xml:space="preserve">Environmental exposure review</w:t>
       </w:r>
     </w:p>
     <w:p>
@@ -2555,7 +2208,7 @@
           <w:sz w:val="20"/>
           <w:szCs w:val="20"/>
         </w:rPr>
-        <w:t xml:space="preserve">The practitioner may wish to explore with the patient sleep hygiene, circadian alignment (morning light exposure, consistent bedtime), workload/recovery balance, and stress-reduction practices.</w:t>
+        <w:t xml:space="preserve">Detectable blood lead (14.05 µg/L) and aluminium at upper reference (28.13 µg/L) suggest the practitioner may wish to explore environmental and occupational exposures with the patient.</w:t>
       </w:r>
     </w:p>
     <w:p>
@@ -2580,7 +2233,7 @@
           <w:sz w:val="20"/>
           <w:szCs w:val="20"/>
         </w:rPr>
-        <w:t xml:space="preserve">Low total urinary cortisol pattern alongside the patient's reported symptoms (fatigue cluster, sleep difficulty, burned-out feeling per symptom report) — for practitioner consideration.</w:t>
+        <w:t xml:space="preserve">Supports the toxicant-burdened pattern and informs Phase II support.</w:t>
       </w:r>
     </w:p>
     <w:p>
@@ -2596,7 +2249,7 @@
           <w:sz w:val="22"/>
           <w:szCs w:val="22"/>
         </w:rPr>
-        <w:t xml:space="preserve">Fibre and bowel transit</w:t>
+        <w:t xml:space="preserve">Sleep and HPA regulation</w:t>
       </w:r>
     </w:p>
     <w:p>
@@ -2621,7 +2274,7 @@
           <w:sz w:val="20"/>
           <w:szCs w:val="20"/>
         </w:rPr>
-        <w:t xml:space="preserve">The practitioner may wish to discuss adequate soluble and insoluble fibre intake and regular bowel transit to support enterohepatic clearance of conjugated oestrogen metabolites.</w:t>
+        <w:t xml:space="preserve">Cortisol OA 19.7 ug/gCR is within reference. The practitioner may wish to explore sleep quality and stress load as contributors to the inflammatory pattern and thyroid conversion.</w:t>
       </w:r>
     </w:p>
     <w:p>
@@ -2646,139 +2299,7 @@
           <w:sz w:val="20"/>
           <w:szCs w:val="20"/>
         </w:rPr>
-        <w:t xml:space="preserve">Pattern consistent with reduced oestrogen quotient and 2:16 ratio supports consideration of enterohepatic clearance optimisation.</w:t>
-      </w:r>
-    </w:p>
-    <w:p>
-      <w:pPr>
-        <w:spacing w:after="60" w:before="120"/>
-      </w:pPr>
-      <w:r>
-        <w:rPr>
-          <w:rFonts w:ascii="Roboto" w:cs="Roboto" w:eastAsia="Roboto" w:hAnsi="Roboto"/>
-          <w:b/>
-          <w:bCs/>
-          <w:color w:val="535B50"/>
-          <w:sz w:val="22"/>
-          <w:szCs w:val="22"/>
-        </w:rPr>
-        <w:t xml:space="preserve">Alcohol moderation</w:t>
-      </w:r>
-    </w:p>
-    <w:p>
-      <w:pPr>
-        <w:spacing w:after="60"/>
-      </w:pPr>
-      <w:r>
-        <w:rPr>
-          <w:rFonts w:ascii="Roboto" w:cs="Roboto" w:eastAsia="Roboto" w:hAnsi="Roboto"/>
-          <w:b/>
-          <w:bCs/>
-          <w:color w:val="535B50"/>
-          <w:sz w:val="20"/>
-          <w:szCs w:val="20"/>
-        </w:rPr>
-        <w:t xml:space="preserve">Consideration: </w:t>
-      </w:r>
-      <w:r>
-        <w:rPr>
-          <w:rFonts w:ascii="Roboto" w:cs="Roboto" w:eastAsia="Roboto" w:hAnsi="Roboto"/>
-          <w:color w:val="000000"/>
-          <w:sz w:val="20"/>
-          <w:szCs w:val="20"/>
-        </w:rPr>
-        <w:t xml:space="preserve">The practitioner may wish to discuss alcohol intake as published literature identifies alcohol as a factor that may influence oestrogen metabolism and hepatic Phase II conjugation.</w:t>
-      </w:r>
-    </w:p>
-    <w:p>
-      <w:pPr>
-        <w:spacing w:after="60"/>
-      </w:pPr>
-      <w:r>
-        <w:rPr>
-          <w:rFonts w:ascii="Roboto" w:cs="Roboto" w:eastAsia="Roboto" w:hAnsi="Roboto"/>
-          <w:b/>
-          <w:bCs/>
-          <w:color w:val="535B50"/>
-          <w:sz w:val="20"/>
-          <w:szCs w:val="20"/>
-        </w:rPr>
-        <w:t xml:space="preserve">Rationale: </w:t>
-      </w:r>
-      <w:r>
-        <w:rPr>
-          <w:rFonts w:ascii="Roboto" w:cs="Roboto" w:eastAsia="Roboto" w:hAnsi="Roboto"/>
-          <w:color w:val="000000"/>
-          <w:sz w:val="20"/>
-          <w:szCs w:val="20"/>
-        </w:rPr>
-        <w:t xml:space="preserve">For practitioner consideration in the context of oestrogen-metabolism pattern findings.</w:t>
-      </w:r>
-    </w:p>
-    <w:p>
-      <w:pPr>
-        <w:spacing w:after="60" w:before="120"/>
-      </w:pPr>
-      <w:r>
-        <w:rPr>
-          <w:rFonts w:ascii="Roboto" w:cs="Roboto" w:eastAsia="Roboto" w:hAnsi="Roboto"/>
-          <w:b/>
-          <w:bCs/>
-          <w:color w:val="535B50"/>
-          <w:sz w:val="22"/>
-          <w:szCs w:val="22"/>
-        </w:rPr>
-        <w:t xml:space="preserve">Protein adequacy</w:t>
-      </w:r>
-    </w:p>
-    <w:p>
-      <w:pPr>
-        <w:spacing w:after="60"/>
-      </w:pPr>
-      <w:r>
-        <w:rPr>
-          <w:rFonts w:ascii="Roboto" w:cs="Roboto" w:eastAsia="Roboto" w:hAnsi="Roboto"/>
-          <w:b/>
-          <w:bCs/>
-          <w:color w:val="535B50"/>
-          <w:sz w:val="20"/>
-          <w:szCs w:val="20"/>
-        </w:rPr>
-        <w:t xml:space="preserve">Consideration: </w:t>
-      </w:r>
-      <w:r>
-        <w:rPr>
-          <w:rFonts w:ascii="Roboto" w:cs="Roboto" w:eastAsia="Roboto" w:hAnsi="Roboto"/>
-          <w:color w:val="000000"/>
-          <w:sz w:val="20"/>
-          <w:szCs w:val="20"/>
-        </w:rPr>
-        <w:t xml:space="preserve">The practitioner may wish to assess protein adequacy as amino acids (glycine, taurine, methionine) are substrates for Phase II conjugation pathways.</w:t>
-      </w:r>
-    </w:p>
-    <w:p>
-      <w:pPr>
-        <w:spacing w:after="60"/>
-      </w:pPr>
-      <w:r>
-        <w:rPr>
-          <w:rFonts w:ascii="Roboto" w:cs="Roboto" w:eastAsia="Roboto" w:hAnsi="Roboto"/>
-          <w:b/>
-          <w:bCs/>
-          <w:color w:val="535B50"/>
-          <w:sz w:val="20"/>
-          <w:szCs w:val="20"/>
-        </w:rPr>
-        <w:t xml:space="preserve">Rationale: </w:t>
-      </w:r>
-      <w:r>
-        <w:rPr>
-          <w:rFonts w:ascii="Roboto" w:cs="Roboto" w:eastAsia="Roboto" w:hAnsi="Roboto"/>
-          <w:color w:val="000000"/>
-          <w:sz w:val="20"/>
-          <w:szCs w:val="20"/>
-        </w:rPr>
-        <w:t xml:space="preserve">Supports overall oestrogen and xenobiotic conjugation capacity.</w:t>
+        <w:t xml:space="preserve">HPA regulation supports thyroid conversion and inflammation resolution.</w:t>
       </w:r>
     </w:p>
     <w:p>
@@ -2829,7 +2350,7 @@
           <w:sz w:val="22"/>
           <w:szCs w:val="22"/>
         </w:rPr>
-        <w:t xml:space="preserve">The formulation addresses three recognised patterns: (1) HPA-hypocortisolism, (2) 16-OH-dominant oestrogen metabolism with low 2-OH substrate, and (3) preserved-but-substrate-limited COMT methylation. The hormone_metabolism axis receives primary allocation given the panel is principally an oestrogen-metabolism panel; the thyroid_adaptogenic axis receives strong secondary allocation for HPA support; methylation cofactors, magnesium, mitochondrial/adrenal support (CoQ10), antioxidant redox, and vitamin C/D round out the formulation. Foundational ingredients are placed across all activated axes first, then the pod is filled with complementary layer ingredients via cycling in priority order. The Step 3 foundational-pass running total was approximately 470 granules, well below the 1000-granule threshold for catalyst-layer strategy, so the standard layer-pass strategy applies. Per-ingredient doses sit within Library maxima and overall pod loading is targeted at the 630–710 granule fill range.</w:t>
+        <w:t xml:space="preserve">The formulation addresses four active axes activated by the biomarker panel: (1) anti_inflammatory_core as primary (hsCRP elevated) with a full stack of turmeric, boswellia, quercetin, and resveratrol; (2) antioxidant_redox / heavy_metal_detox as primary (mild toxicant burden, NAC OA low, Cu:Zn upper reference) with NAC, glutathione, ALA, milk thistle, and calcium D-glucarate; (3) thyroid_adaptogenic as secondary (FT3:RT3 ratio low) with ashwagandha, rhodiola, zinc citrate, and conservative iodine (permitted since antibodies negative); (4) mitochondrial_cardiovascular as secondary (TCA intermediates low, VLDL mildly elevated) with CoQ10, alpha-lipoic acid, and bergamot. Supportive axes: b_vitamins_methylation (broad cofactor support including P5P, B2, B3, B5, thiamine, methylcobalamin, folate); minerals (magnesium glycinate as TCA/mitochondrial cofactor); and vitamin_d_c_neurotransmitter (vitamin C, vitamin D3). Given a 4-pattern panel, the pod-fill principle is applied — targeting the 660–690 running estimate range through breadth across axes at moderate doses. Binding exclusions applied: copper (Cu:Zn 1.50 at upper reference threshold) and selenium (RBC selenium 498.9 at 99.8% of upper reference).</w:t>
       </w:r>
     </w:p>
     <w:p>
@@ -2870,7 +2391,7 @@
           <w:sz w:val="20"/>
           <w:szCs w:val="20"/>
         </w:rPr>
-        <w:t xml:space="preserve">DIM (W140019000) at 100 mg as the foundational hormone_metabolism agent for shifting Phase I oestrogen hydroxylation toward 2-OH pathway — directly addresses low 2-OH Estrone and low 2:16 ratio.</w:t>
+        <w:t xml:space="preserve">Turmeric (Curcumin) — 500 mg: Foundational anti-inflammatory anchor for the inflammatory-metabolic pattern (hsCRP 6.88 mg/L). RCT evidence supports curcumin's potential to reduce hsCRP in chronic inflammation contexts. Dose reduced from clinical target 1000 mg to fit pod budget alongside stacked ingredients.</w:t>
       </w:r>
     </w:p>
     <w:p>
@@ -2895,7 +2416,7 @@
           <w:sz w:val="20"/>
           <w:szCs w:val="20"/>
         </w:rPr>
-        <w:t xml:space="preserve">Calcium D-glucarate (W040012000) at 500 mg for glucuronidation support and beta-glucuronidase inhibition — supports Phase II clearance of conjugated oestrogens, addressing low oestrogen quotient.</w:t>
+        <w:t xml:space="preserve">Boswellia (Frankincense) — 200 mg: Layer anti-inflammatory targeting the 5-LOX pathway complementary to curcumin's NF-κB mechanism. Moderate dose to preserve pod breadth.</w:t>
       </w:r>
     </w:p>
     <w:p>
@@ -2920,7 +2441,7 @@
           <w:sz w:val="20"/>
           <w:szCs w:val="20"/>
         </w:rPr>
-        <w:t xml:space="preserve">Milk thistle / silymarin (W010013000) at 150 mg for Nrf2-mediated Phase II hepatic conjugation support.</w:t>
+        <w:t xml:space="preserve">Quercetin — 250 mg: Layer anti-inflammatory / mast-cell stabiliser with additional metal-buffering rationale in the context of mild toxicant-burdened pattern.</w:t>
       </w:r>
     </w:p>
     <w:p>
@@ -2945,7 +2466,7 @@
           <w:sz w:val="20"/>
           <w:szCs w:val="20"/>
         </w:rPr>
-        <w:t xml:space="preserve">Resveratrol (W010019000) at 150 mg for mild aromatase modulation and 2-OH pathway support; chosen because the patient is male with mid-range testosterone and patterns suggest oestrogen metabolism balance is the focus rather than androgen modulation.</w:t>
+        <w:t xml:space="preserve">Resveratrol — 150 mg: Layer polyphenol supporting NF-κB modulation and mitochondrial biogenesis (relevant to the TCA-sluggish pattern).</w:t>
       </w:r>
     </w:p>
     <w:p>
@@ -2970,7 +2491,7 @@
           <w:sz w:val="20"/>
           <w:szCs w:val="20"/>
         </w:rPr>
-        <w:t xml:space="preserve">Ashwagandha (W010003000) at 300 mg as the foundational adaptogen for HPA-hypocortisolism pattern — supports HPA resilience.</w:t>
+        <w:t xml:space="preserve">N-acetyl cysteine (NAC) — 600 mg: Foundational glutathione precursor for the antioxidant_redox axis (NAC OA 0.02 at lower reference; pyroglutamic acid 9.0 within reference but supportive of GSH cycling stress in context of toxicant-burden pattern).</w:t>
       </w:r>
     </w:p>
     <w:p>
@@ -2995,7 +2516,7 @@
           <w:sz w:val="20"/>
           <w:szCs w:val="20"/>
         </w:rPr>
-        <w:t xml:space="preserve">Rhodiola (W010020000) at 200 mg as a complementary HPA adaptogen.</w:t>
+        <w:t xml:space="preserve">Glutathione (S-acetyl) — 100 mg: Directly supports the intracellular antioxidant pool; complementary to NAC precursor pathway. Dose reduced to preserve pod breadth.</w:t>
       </w:r>
     </w:p>
     <w:p>
@@ -3020,7 +2541,7 @@
           <w:sz w:val="20"/>
           <w:szCs w:val="20"/>
         </w:rPr>
-        <w:t xml:space="preserve">American ginseng (W010001000) at 200 mg as additional HPA support given the low cortisol pattern.</w:t>
+        <w:t xml:space="preserve">Alpha-lipoic acid — 150 mg: Antioxidant and mitochondrial cofactor with additional glucose-metabolism support relevant to the inflammatory-metabolic pattern (fasting glucose at upper reference 5.4).</w:t>
       </w:r>
     </w:p>
     <w:p>
@@ -3045,7 +2566,7 @@
           <w:sz w:val="20"/>
           <w:szCs w:val="20"/>
         </w:rPr>
-        <w:t xml:space="preserve">Coenzyme Q10 (W030021000) at 100 mg for mitochondrial/adrenal energetics in the context of HPA-hypocortisolism.</w:t>
+        <w:t xml:space="preserve">Milk thistle (Silymarin) — 200 mg: Phase II hepatic support (Nrf2-mediated) in the context of mild toxicant-burden pattern (aluminium at upper reference, detectable lead). GGT is low-normal (10) — mildly reduced hepatic conjugation capacity possible.</w:t>
       </w:r>
     </w:p>
     <w:p>
@@ -3070,7 +2591,7 @@
           <w:sz w:val="20"/>
           <w:szCs w:val="20"/>
         </w:rPr>
-        <w:t xml:space="preserve">Methylcobalamin B12 (W030008000) at 500 mcg, Calcium folinate (W030027000) at 547 mcg (capped at TGA maximum of 500 mcg folinic acid), P5P/B6 (W030012000) at 15.68 mg, Riboflavin B2 (W030011000) at 20 mg — methylation cofactor stack supporting COMT and overall methylation cycle.</w:t>
+        <w:t xml:space="preserve">Calcium D-glucarate — 200 mg: Supports glucuronidation Phase II conjugation, relevant to the toxicant-burden pattern.</w:t>
       </w:r>
     </w:p>
     <w:p>
@@ -3095,7 +2616,7 @@
           <w:sz w:val="20"/>
           <w:szCs w:val="20"/>
         </w:rPr>
-        <w:t xml:space="preserve">Pantothenic acid B5 (W030004000) at 218.4 mg as specific adrenal cofactor (CoA precursor) for HPA support.</w:t>
+        <w:t xml:space="preserve">Coenzyme Q10 — 100 mg: Mitochondrial electron transport chain support; TCA intermediates in the lower portion of reference, and CoQ10 flagged on the lab's own nutritional guide at 90 mg. 100 mg is a common clinical target dose.</w:t>
       </w:r>
     </w:p>
     <w:p>
@@ -3120,7 +2641,7 @@
           <w:sz w:val="20"/>
           <w:szCs w:val="20"/>
         </w:rPr>
-        <w:t xml:space="preserve">Nicotinamide B3 (W030003000) at 50 mg for general energy/redox support.</w:t>
+        <w:t xml:space="preserve">Bergamot — 250 mg: Lipid/metabolic support in the context of mildly elevated VLDL (0.7). Dose reduced from clinical target to preserve pod breadth.</w:t>
       </w:r>
     </w:p>
     <w:p>
@@ -3145,7 +2666,7 @@
           <w:sz w:val="20"/>
           <w:szCs w:val="20"/>
         </w:rPr>
-        <w:t xml:space="preserve">Magnesium glycinate (W040002000) at 119.7 mg elemental (1023.5 mg salt) — COMT cofactor and HPA support; dose-reduced from 300 mg elemental clinical target to fit the pod budget.</w:t>
+        <w:t xml:space="preserve">Ashwagandha — 300 mg: HPA-thyroid axis adaptogen supporting the thyroid-conversion-impaired pattern (FT3:RT3 0.787).</w:t>
       </w:r>
     </w:p>
     <w:p>
@@ -3170,7 +2691,7 @@
           <w:sz w:val="20"/>
           <w:szCs w:val="20"/>
         </w:rPr>
-        <w:t xml:space="preserve">Zinc citrate (W040008000) at 24.92 mg elemental — moderate dose for aromatase modulation, immune and steroidogenic support; deliberately moderate rather than maximum given testosterone is mid-range.</w:t>
+        <w:t xml:space="preserve">Rhodiola — 200 mg: Second adaptogen supporting stress response and HPA-axis alongside ashwagandha.</w:t>
       </w:r>
     </w:p>
     <w:p>
@@ -3195,7 +2716,7 @@
           <w:sz w:val="20"/>
           <w:szCs w:val="20"/>
         </w:rPr>
-        <w:t xml:space="preserve">NAC (W140010000) at 500 mg as antioxidant/quinone-quenching agent and glutathione precursor.</w:t>
+        <w:t xml:space="preserve">Potassium iodide (iodine) — 131 mcg: Conservative iodine dose permitted per binding-exclusion rules (thyroid antibodies negative: TPO 9.0, Tg 16.3, TRAb 0.8). Supports thyroid conversion. Deliberately kept at ≤150 mcg conservative floor given Reverse T3 elevated and general caution.</w:t>
       </w:r>
     </w:p>
     <w:p>
@@ -3220,7 +2741,7 @@
           <w:sz w:val="20"/>
           <w:szCs w:val="20"/>
         </w:rPr>
-        <w:t xml:space="preserve">Quercetin (W010031000) at 227.2 mg (250 mg salt) for antioxidant and oestrogen-metabolism support.</w:t>
+        <w:t xml:space="preserve">Zinc citrate — 62.3 mg: Plasma zinc 9.9 µmol/L in the lower portion of the reference range; Cu:Zn ratio 1.50 at upper reference limit. Zinc is also a deiodinase cofactor and supports the thyroid-conversion axis. Zinc supplementation is the appropriate move to lower Cu:Zn without adding copper.</w:t>
       </w:r>
     </w:p>
     <w:p>
@@ -3245,7 +2766,7 @@
           <w:sz w:val="20"/>
           <w:szCs w:val="20"/>
         </w:rPr>
-        <w:t xml:space="preserve">Vitamin C (W030001000) at 500 mg as adrenal cofactor and antioxidant.</w:t>
+        <w:t xml:space="preserve">Magnesium glycinate — 100 mg: Magnesium was flagged at 525 mg on the lab's own nutritional guide. Included at moderate elemental dose (100 mg) within pod budget. Serves as TCA/mitochondrial cofactor and calming/sleep support. Practitioner may wish to consider additional standalone magnesium if the patient requires higher elemental doses.</w:t>
       </w:r>
     </w:p>
     <w:p>
@@ -3270,7 +2791,207 @@
           <w:sz w:val="20"/>
           <w:szCs w:val="20"/>
         </w:rPr>
-        <w:t xml:space="preserve">Vitamin D3 (W030005000) at 25 mcg (1000 IU) for general endocrine support at Library maximum daily dose.</w:t>
+        <w:t xml:space="preserve">Vitamin B6 (P5P) — 15.68 mg: B6 flagged on the lab's nutritional guide at 150 mg. Conservative P5P dose (10 mg elemental pyridoxine equivalent) applied due to TGA scheduling requirements and the neuropathy safety signal. B6 is a deiodinase and neurotransmitter cofactor.</w:t>
+      </w:r>
+    </w:p>
+    <w:p>
+      <w:pPr>
+        <w:spacing w:after="60"/>
+      </w:pPr>
+      <w:r>
+        <w:rPr>
+          <w:rFonts w:ascii="Roboto" w:cs="Roboto" w:eastAsia="Roboto" w:hAnsi="Roboto"/>
+          <w:b/>
+          <w:bCs/>
+          <w:color w:val="C3AF88"/>
+          <w:sz w:val="22"/>
+          <w:szCs w:val="22"/>
+        </w:rPr>
+        <w:t xml:space="preserve">• </w:t>
+      </w:r>
+      <w:r>
+        <w:rPr>
+          <w:rFonts w:ascii="Roboto" w:cs="Roboto" w:eastAsia="Roboto" w:hAnsi="Roboto"/>
+          <w:color w:val="000000"/>
+          <w:sz w:val="20"/>
+          <w:szCs w:val="20"/>
+        </w:rPr>
+        <w:t xml:space="preserve">Riboflavin (Vitamin B2) — 20 mg: B2 (glutaric acid 0.08) low-normal; B2 flagged at 22.5 mg on lab's nutritional guide. Supports fatty-acid metabolism, deiodinase pathways, and TCA function.</w:t>
+      </w:r>
+    </w:p>
+    <w:p>
+      <w:pPr>
+        <w:spacing w:after="60"/>
+      </w:pPr>
+      <w:r>
+        <w:rPr>
+          <w:rFonts w:ascii="Roboto" w:cs="Roboto" w:eastAsia="Roboto" w:hAnsi="Roboto"/>
+          <w:b/>
+          <w:bCs/>
+          <w:color w:val="C3AF88"/>
+          <w:sz w:val="22"/>
+          <w:szCs w:val="22"/>
+        </w:rPr>
+        <w:t xml:space="preserve">• </w:t>
+      </w:r>
+      <w:r>
+        <w:rPr>
+          <w:rFonts w:ascii="Roboto" w:cs="Roboto" w:eastAsia="Roboto" w:hAnsi="Roboto"/>
+          <w:color w:val="000000"/>
+          <w:sz w:val="20"/>
+          <w:szCs w:val="20"/>
+        </w:rPr>
+        <w:t xml:space="preserve">Nicotinamide (Vitamin B3) — 100 mg: B3 flagged at 100 mg on lab's nutritional guide. Nicotinamide form (not niacin) supports NAD+ pools relevant to the TCA-sluggish pattern and general methylation background.</w:t>
+      </w:r>
+    </w:p>
+    <w:p>
+      <w:pPr>
+        <w:spacing w:after="60"/>
+      </w:pPr>
+      <w:r>
+        <w:rPr>
+          <w:rFonts w:ascii="Roboto" w:cs="Roboto" w:eastAsia="Roboto" w:hAnsi="Roboto"/>
+          <w:b/>
+          <w:bCs/>
+          <w:color w:val="C3AF88"/>
+          <w:sz w:val="22"/>
+          <w:szCs w:val="22"/>
+        </w:rPr>
+        <w:t xml:space="preserve">• </w:t>
+      </w:r>
+      <w:r>
+        <w:rPr>
+          <w:rFonts w:ascii="Roboto" w:cs="Roboto" w:eastAsia="Roboto" w:hAnsi="Roboto"/>
+          <w:color w:val="000000"/>
+          <w:sz w:val="20"/>
+          <w:szCs w:val="20"/>
+        </w:rPr>
+        <w:t xml:space="preserve">Pantothenic acid (Vitamin B5) — 100 mg: B5 flagged at 200 mg on the lab's own nutritional guide (pantothenic acid OA 0.39 low-normal). Adrenal cofactor and CoA precursor relevant to TCA and steroid synthesis. Included at moderate dose within pod budget.</w:t>
+      </w:r>
+    </w:p>
+    <w:p>
+      <w:pPr>
+        <w:spacing w:after="60"/>
+      </w:pPr>
+      <w:r>
+        <w:rPr>
+          <w:rFonts w:ascii="Roboto" w:cs="Roboto" w:eastAsia="Roboto" w:hAnsi="Roboto"/>
+          <w:b/>
+          <w:bCs/>
+          <w:color w:val="C3AF88"/>
+          <w:sz w:val="22"/>
+          <w:szCs w:val="22"/>
+        </w:rPr>
+        <w:t xml:space="preserve">• </w:t>
+      </w:r>
+      <w:r>
+        <w:rPr>
+          <w:rFonts w:ascii="Roboto" w:cs="Roboto" w:eastAsia="Roboto" w:hAnsi="Roboto"/>
+          <w:color w:val="000000"/>
+          <w:sz w:val="20"/>
+          <w:szCs w:val="20"/>
+        </w:rPr>
+        <w:t xml:space="preserve">Thiamine (Vitamin B1) — 20 mg: B1 flagged at 5 mg on nutritional guide. Cofactor for pyruvate → acetyl-CoA and TCA function. Included at moderate dose above lab's recommendation given the TCA-sluggish pattern.</w:t>
+      </w:r>
+    </w:p>
+    <w:p>
+      <w:pPr>
+        <w:spacing w:after="60"/>
+      </w:pPr>
+      <w:r>
+        <w:rPr>
+          <w:rFonts w:ascii="Roboto" w:cs="Roboto" w:eastAsia="Roboto" w:hAnsi="Roboto"/>
+          <w:b/>
+          <w:bCs/>
+          <w:color w:val="C3AF88"/>
+          <w:sz w:val="22"/>
+          <w:szCs w:val="22"/>
+        </w:rPr>
+        <w:t xml:space="preserve">• </w:t>
+      </w:r>
+      <w:r>
+        <w:rPr>
+          <w:rFonts w:ascii="Roboto" w:cs="Roboto" w:eastAsia="Roboto" w:hAnsi="Roboto"/>
+          <w:color w:val="000000"/>
+          <w:sz w:val="20"/>
+          <w:szCs w:val="20"/>
+        </w:rPr>
+        <w:t xml:space="preserve">Methylcobalamin (Vitamin B12) — 500 mcg: Homocysteine 8.1 µmol/L (within reference); activated B12 91.3 pmol/L (adequate). Included at moderate maintenance dose as background methylation support alongside folate.</w:t>
+      </w:r>
+    </w:p>
+    <w:p>
+      <w:pPr>
+        <w:spacing w:after="60"/>
+      </w:pPr>
+      <w:r>
+        <w:rPr>
+          <w:rFonts w:ascii="Roboto" w:cs="Roboto" w:eastAsia="Roboto" w:hAnsi="Roboto"/>
+          <w:b/>
+          <w:bCs/>
+          <w:color w:val="C3AF88"/>
+          <w:sz w:val="22"/>
+          <w:szCs w:val="22"/>
+        </w:rPr>
+        <w:t xml:space="preserve">• </w:t>
+      </w:r>
+      <w:r>
+        <w:rPr>
+          <w:rFonts w:ascii="Roboto" w:cs="Roboto" w:eastAsia="Roboto" w:hAnsi="Roboto"/>
+          <w:color w:val="000000"/>
+          <w:sz w:val="20"/>
+          <w:szCs w:val="20"/>
+        </w:rPr>
+        <w:t xml:space="preserve">Calcium folinate (folate) — 218.788 mcg: Serum folate 19 nmol/L (adequate) but background methylation cofactor supports overall methylation cycle, especially with B12.</w:t>
+      </w:r>
+    </w:p>
+    <w:p>
+      <w:pPr>
+        <w:spacing w:after="60"/>
+      </w:pPr>
+      <w:r>
+        <w:rPr>
+          <w:rFonts w:ascii="Roboto" w:cs="Roboto" w:eastAsia="Roboto" w:hAnsi="Roboto"/>
+          <w:b/>
+          <w:bCs/>
+          <w:color w:val="C3AF88"/>
+          <w:sz w:val="22"/>
+          <w:szCs w:val="22"/>
+        </w:rPr>
+        <w:t xml:space="preserve">• </w:t>
+      </w:r>
+      <w:r>
+        <w:rPr>
+          <w:rFonts w:ascii="Roboto" w:cs="Roboto" w:eastAsia="Roboto" w:hAnsi="Roboto"/>
+          <w:color w:val="000000"/>
+          <w:sz w:val="20"/>
+          <w:szCs w:val="20"/>
+        </w:rPr>
+        <w:t xml:space="preserve">Vitamin C — 500 mg: Vitamin C flagged at 1500 mg on the lab's own nutritional guide (ascorbic acid OA 4.13 mid-range). Included at moderate 500 mg dose as antioxidant background and adrenal cofactor.</w:t>
+      </w:r>
+    </w:p>
+    <w:p>
+      <w:pPr>
+        <w:spacing w:after="60"/>
+      </w:pPr>
+      <w:r>
+        <w:rPr>
+          <w:rFonts w:ascii="Roboto" w:cs="Roboto" w:eastAsia="Roboto" w:hAnsi="Roboto"/>
+          <w:b/>
+          <w:bCs/>
+          <w:color w:val="C3AF88"/>
+          <w:sz w:val="22"/>
+          <w:szCs w:val="22"/>
+        </w:rPr>
+        <w:t xml:space="preserve">• </w:t>
+      </w:r>
+      <w:r>
+        <w:rPr>
+          <w:rFonts w:ascii="Roboto" w:cs="Roboto" w:eastAsia="Roboto" w:hAnsi="Roboto"/>
+          <w:color w:val="000000"/>
+          <w:sz w:val="20"/>
+          <w:szCs w:val="20"/>
+        </w:rPr>
+        <w:t xml:space="preserve">Vitamin D3 (colecalciferol) — 25 mcg: 25-OH Vitamin D 69 nmol/L (lower-mid reference). Conservative maintenance dose (25 mcg = 1000 IU) at TGA maximum daily.</w:t>
       </w:r>
     </w:p>
     <w:p>
@@ -3311,7 +3032,7 @@
           <w:sz w:val="20"/>
           <w:szCs w:val="20"/>
         </w:rPr>
-        <w:t xml:space="preserve">Saw palmetto (W010043000) — Testosterone is mid-range and androgen-excess pattern is not activated on this panel; 5-alpha-reductase suppression is not indicated.</w:t>
+        <w:t xml:space="preserve">Copper (any form) — Cu:Zn ratio 1.50 at upper reference limit; binding exclusion applied automatically to prevent worsening the ratio.</w:t>
       </w:r>
     </w:p>
     <w:p>
@@ -3336,7 +3057,7 @@
           <w:sz w:val="20"/>
           <w:szCs w:val="20"/>
         </w:rPr>
-        <w:t xml:space="preserve">High-dose iodine (&gt;150 mcg) — Conservative binding-exclusion principle in the absence of thyroid antibody data on this panel; not indicated by HMP findings.</w:t>
+        <w:t xml:space="preserve">Selenium / selenomethionine — RBC selenium 498.9 µg/L (99.8% of upper reference 500.0 µg/L). Binding exclusion applied — selenosis is cumulative.</w:t>
       </w:r>
     </w:p>
     <w:p>
@@ -3361,7 +3082,7 @@
           <w:sz w:val="20"/>
           <w:szCs w:val="20"/>
         </w:rPr>
-        <w:t xml:space="preserve">Selenium — Not indicated by panel findings; no thyroid driver activated. Excluded by deprioritisation rather than binding exclusion.</w:t>
+        <w:t xml:space="preserve">Iron (any form) — Ferritin 243 µg/L (upper portion of reference) and transferrin saturation 32%; no indication for iron supplementation, and pattern does not support iron addition.</w:t>
       </w:r>
     </w:p>
     <w:p>
@@ -3386,7 +3107,7 @@
           <w:sz w:val="20"/>
           <w:szCs w:val="20"/>
         </w:rPr>
-        <w:t xml:space="preserve">Iron — Not indicated by panel findings; no iron-deficiency or iron-overload pattern activated.</w:t>
+        <w:t xml:space="preserve">High-dose vitamin A — No specific indication on the panel; conservative default omit.</w:t>
       </w:r>
     </w:p>
     <w:p>
@@ -3411,82 +3132,7 @@
           <w:sz w:val="20"/>
           <w:szCs w:val="20"/>
         </w:rPr>
-        <w:t xml:space="preserve">Copper — Not indicated by panel findings; no Cu/Zn imbalance pattern available from this panel.</w:t>
-      </w:r>
-    </w:p>
-    <w:p>
-      <w:pPr>
-        <w:spacing w:after="60"/>
-      </w:pPr>
-      <w:r>
-        <w:rPr>
-          <w:rFonts w:ascii="Roboto" w:cs="Roboto" w:eastAsia="Roboto" w:hAnsi="Roboto"/>
-          <w:b/>
-          <w:bCs/>
-          <w:color w:val="C3AF88"/>
-          <w:sz w:val="22"/>
-          <w:szCs w:val="22"/>
-        </w:rPr>
-        <w:t xml:space="preserve">• </w:t>
-      </w:r>
-      <w:r>
-        <w:rPr>
-          <w:rFonts w:ascii="Roboto" w:cs="Roboto" w:eastAsia="Roboto" w:hAnsi="Roboto"/>
-          <w:color w:val="000000"/>
-          <w:sz w:val="20"/>
-          <w:szCs w:val="20"/>
-        </w:rPr>
-        <w:t xml:space="preserve">5-HTP — No serotonergic driver on this panel; serotonin-syndrome risk principle applies as a general caution given medications were not provided.</w:t>
-      </w:r>
-    </w:p>
-    <w:p>
-      <w:pPr>
-        <w:spacing w:after="60"/>
-      </w:pPr>
-      <w:r>
-        <w:rPr>
-          <w:rFonts w:ascii="Roboto" w:cs="Roboto" w:eastAsia="Roboto" w:hAnsi="Roboto"/>
-          <w:b/>
-          <w:bCs/>
-          <w:color w:val="C3AF88"/>
-          <w:sz w:val="22"/>
-          <w:szCs w:val="22"/>
-        </w:rPr>
-        <w:t xml:space="preserve">• </w:t>
-      </w:r>
-      <w:r>
-        <w:rPr>
-          <w:rFonts w:ascii="Roboto" w:cs="Roboto" w:eastAsia="Roboto" w:hAnsi="Roboto"/>
-          <w:color w:val="000000"/>
-          <w:sz w:val="20"/>
-          <w:szCs w:val="20"/>
-        </w:rPr>
-        <w:t xml:space="preserve">Berberine — Glucose / cardiometabolic axis is not activated by this panel.</w:t>
-      </w:r>
-    </w:p>
-    <w:p>
-      <w:pPr>
-        <w:spacing w:after="60"/>
-      </w:pPr>
-      <w:r>
-        <w:rPr>
-          <w:rFonts w:ascii="Roboto" w:cs="Roboto" w:eastAsia="Roboto" w:hAnsi="Roboto"/>
-          <w:b/>
-          <w:bCs/>
-          <w:color w:val="C3AF88"/>
-          <w:sz w:val="22"/>
-          <w:szCs w:val="22"/>
-        </w:rPr>
-        <w:t xml:space="preserve">• </w:t>
-      </w:r>
-      <w:r>
-        <w:rPr>
-          <w:rFonts w:ascii="Roboto" w:cs="Roboto" w:eastAsia="Roboto" w:hAnsi="Roboto"/>
-          <w:color w:val="000000"/>
-          <w:sz w:val="20"/>
-          <w:szCs w:val="20"/>
-        </w:rPr>
-        <w:t xml:space="preserve">Vitex / Chaste tree — Patient is male; not indicated.</w:t>
+        <w:t xml:space="preserve">5-HTP — No specific serotonergic indication on the biomarker profile; conservative default omit. Also mitigates any serotonergic medication interaction risk in absence of medication history.</w:t>
       </w:r>
     </w:p>
     <w:p>
@@ -3553,7 +3199,7 @@
           <w:sz w:val="22"/>
           <w:szCs w:val="22"/>
         </w:rPr>
-        <w:t xml:space="preserve">6 contraindication or interaction consideration(s) raised for practitioner review.</w:t>
+        <w:t xml:space="preserve">4 contraindication or interaction consideration(s) raised for practitioner review.</w:t>
       </w:r>
     </w:p>
     <w:tbl>
@@ -3760,7 +3406,7 @@
                 <w:sz w:val="20"/>
                 <w:szCs w:val="20"/>
               </w:rPr>
-              <w:t xml:space="preserve">No medication context provided</w:t>
+              <w:t xml:space="preserve">medication_context_not_provided</w:t>
             </w:r>
           </w:p>
         </w:tc>
@@ -3790,7 +3436,7 @@
                 <w:sz w:val="20"/>
                 <w:szCs w:val="20"/>
               </w:rPr>
-              <w:t xml:space="preserve">Practitioner's clinical notes did not list current medications. Standard contraindication checks are therefore based on the formulation alone. The practitioner may wish to confirm absence of: anticoagulants (relevant to resveratrol and CoQ10 per TGA warnings), thyroid medications (relevant to ashwagandha caution), immunosuppressants (relevant to adaptogens), glucose-lowering agents (relevant to American ginseng), antihypertensives (relevant to American ginseng), and CYP3A4/2D6 substrates.</w:t>
+              <w:t xml:space="preserve">The practitioner did not provide a current medication list in the clinical notes. The formulation is provided based on the panel findings alone. The practitioner is asked to review standard contraindication checks in context: (a) berberine with glucose-lowering medications — note that berberine is NOT in this formulation, however this reflects the design choice not the absence of check; (b) curcumin/resveratrol/quercetin with anticoagulants — bleeding-risk review; (c) zinc long-term with copper ratio — retest at follow-up; (d) ashwagandha with thyroid medication if any; (e) magnesium with certain antibiotics/bisphosphonates — chelation timing.</w:t>
             </w:r>
           </w:p>
         </w:tc>
@@ -3820,251 +3466,7 @@
                 <w:sz w:val="20"/>
                 <w:szCs w:val="20"/>
               </w:rPr>
-              <w:t xml:space="preserve">—</w:t>
-            </w:r>
-          </w:p>
-        </w:tc>
-      </w:tr>
-      <w:tr>
-        <w:tc>
-          <w:tcPr>
-            <w:tcW w:type="dxa" w:w="1263"/>
-            <w:tcBorders>
-              <w:top w:val="single" w:color="CCCCCC" w:sz="4"/>
-              <w:left w:val="single" w:color="CCCCCC" w:sz="4"/>
-              <w:bottom w:val="single" w:color="CCCCCC" w:sz="4"/>
-              <w:right w:val="single" w:color="CCCCCC" w:sz="4"/>
-            </w:tcBorders>
-            <w:tcMar>
-              <w:top w:type="dxa" w:w="100"/>
-              <w:left w:type="dxa" w:w="140"/>
-              <w:bottom w:type="dxa" w:w="100"/>
-              <w:right w:type="dxa" w:w="140"/>
-            </w:tcMar>
-          </w:tcPr>
-          <w:p>
-            <w:r>
-              <w:rPr>
-                <w:rFonts w:ascii="Roboto" w:cs="Roboto" w:eastAsia="Roboto" w:hAnsi="Roboto"/>
-                <w:b/>
-                <w:bCs/>
-                <w:color w:val="C3AF88"/>
-                <w:sz w:val="20"/>
-                <w:szCs w:val="20"/>
-              </w:rPr>
-              <w:t xml:space="preserve">moderate</w:t>
-            </w:r>
-          </w:p>
-        </w:tc>
-        <w:tc>
-          <w:tcPr>
-            <w:tcW w:type="dxa" w:w="1985"/>
-            <w:tcBorders>
-              <w:top w:val="single" w:color="CCCCCC" w:sz="4"/>
-              <w:left w:val="single" w:color="CCCCCC" w:sz="4"/>
-              <w:bottom w:val="single" w:color="CCCCCC" w:sz="4"/>
-              <w:right w:val="single" w:color="CCCCCC" w:sz="4"/>
-            </w:tcBorders>
-            <w:tcMar>
-              <w:top w:type="dxa" w:w="100"/>
-              <w:left w:type="dxa" w:w="140"/>
-              <w:bottom w:type="dxa" w:w="100"/>
-              <w:right w:type="dxa" w:w="140"/>
-            </w:tcMar>
-          </w:tcPr>
-          <w:p>
-            <w:r>
-              <w:rPr>
-                <w:rFonts w:ascii="Roboto" w:cs="Roboto" w:eastAsia="Roboto" w:hAnsi="Roboto"/>
-                <w:b w:val="false"/>
-                <w:bCs w:val="false"/>
-                <w:color w:val="000000"/>
-                <w:sz w:val="20"/>
-                <w:szCs w:val="20"/>
-              </w:rPr>
-              <w:t xml:space="preserve">Resveratrol — warfarin interaction risk</w:t>
-            </w:r>
-          </w:p>
-        </w:tc>
-        <w:tc>
-          <w:tcPr>
-            <w:tcW w:type="dxa" w:w="4151"/>
-            <w:tcBorders>
-              <w:top w:val="single" w:color="CCCCCC" w:sz="4"/>
-              <w:left w:val="single" w:color="CCCCCC" w:sz="4"/>
-              <w:bottom w:val="single" w:color="CCCCCC" w:sz="4"/>
-              <w:right w:val="single" w:color="CCCCCC" w:sz="4"/>
-            </w:tcBorders>
-            <w:tcMar>
-              <w:top w:type="dxa" w:w="100"/>
-              <w:left w:type="dxa" w:w="140"/>
-              <w:bottom w:type="dxa" w:w="100"/>
-              <w:right w:type="dxa" w:w="140"/>
-            </w:tcMar>
-          </w:tcPr>
-          <w:p>
-            <w:r>
-              <w:rPr>
-                <w:rFonts w:ascii="Roboto" w:cs="Roboto" w:eastAsia="Roboto" w:hAnsi="Roboto"/>
-                <w:b w:val="false"/>
-                <w:bCs w:val="false"/>
-                <w:color w:val="000000"/>
-                <w:sz w:val="20"/>
-                <w:szCs w:val="20"/>
-              </w:rPr>
-              <w:t xml:space="preserve">TGA-required label warning notes resveratrol may affect anticoagulants including warfarin. Confirm patient is not on anticoagulants before recommending.</w:t>
-            </w:r>
-          </w:p>
-        </w:tc>
-        <w:tc>
-          <w:tcPr>
-            <w:tcW w:type="dxa" w:w="1624"/>
-            <w:tcBorders>
-              <w:top w:val="single" w:color="CCCCCC" w:sz="4"/>
-              <w:left w:val="single" w:color="CCCCCC" w:sz="4"/>
-              <w:bottom w:val="single" w:color="CCCCCC" w:sz="4"/>
-              <w:right w:val="single" w:color="CCCCCC" w:sz="4"/>
-            </w:tcBorders>
-            <w:tcMar>
-              <w:top w:type="dxa" w:w="100"/>
-              <w:left w:type="dxa" w:w="140"/>
-              <w:bottom w:type="dxa" w:w="100"/>
-              <w:right w:type="dxa" w:w="140"/>
-            </w:tcMar>
-          </w:tcPr>
-          <w:p>
-            <w:r>
-              <w:rPr>
-                <w:rFonts w:ascii="Roboto" w:cs="Roboto" w:eastAsia="Roboto" w:hAnsi="Roboto"/>
-                <w:b w:val="false"/>
-                <w:bCs w:val="false"/>
-                <w:color w:val="000000"/>
-                <w:sz w:val="20"/>
-                <w:szCs w:val="20"/>
-              </w:rPr>
-              <w:t xml:space="preserve">Resveratrol</w:t>
-            </w:r>
-          </w:p>
-        </w:tc>
-      </w:tr>
-      <w:tr>
-        <w:tc>
-          <w:tcPr>
-            <w:tcW w:type="dxa" w:w="1263"/>
-            <w:tcBorders>
-              <w:top w:val="single" w:color="CCCCCC" w:sz="4"/>
-              <w:left w:val="single" w:color="CCCCCC" w:sz="4"/>
-              <w:bottom w:val="single" w:color="CCCCCC" w:sz="4"/>
-              <w:right w:val="single" w:color="CCCCCC" w:sz="4"/>
-            </w:tcBorders>
-            <w:tcMar>
-              <w:top w:type="dxa" w:w="100"/>
-              <w:left w:type="dxa" w:w="140"/>
-              <w:bottom w:type="dxa" w:w="100"/>
-              <w:right w:type="dxa" w:w="140"/>
-            </w:tcMar>
-          </w:tcPr>
-          <w:p>
-            <w:r>
-              <w:rPr>
-                <w:rFonts w:ascii="Roboto" w:cs="Roboto" w:eastAsia="Roboto" w:hAnsi="Roboto"/>
-                <w:b/>
-                <w:bCs/>
-                <w:color w:val="C3AF88"/>
-                <w:sz w:val="20"/>
-                <w:szCs w:val="20"/>
-              </w:rPr>
-              <w:t xml:space="preserve">moderate</w:t>
-            </w:r>
-          </w:p>
-        </w:tc>
-        <w:tc>
-          <w:tcPr>
-            <w:tcW w:type="dxa" w:w="1985"/>
-            <w:tcBorders>
-              <w:top w:val="single" w:color="CCCCCC" w:sz="4"/>
-              <w:left w:val="single" w:color="CCCCCC" w:sz="4"/>
-              <w:bottom w:val="single" w:color="CCCCCC" w:sz="4"/>
-              <w:right w:val="single" w:color="CCCCCC" w:sz="4"/>
-            </w:tcBorders>
-            <w:tcMar>
-              <w:top w:type="dxa" w:w="100"/>
-              <w:left w:type="dxa" w:w="140"/>
-              <w:bottom w:type="dxa" w:w="100"/>
-              <w:right w:type="dxa" w:w="140"/>
-            </w:tcMar>
-          </w:tcPr>
-          <w:p>
-            <w:r>
-              <w:rPr>
-                <w:rFonts w:ascii="Roboto" w:cs="Roboto" w:eastAsia="Roboto" w:hAnsi="Roboto"/>
-                <w:b w:val="false"/>
-                <w:bCs w:val="false"/>
-                <w:color w:val="000000"/>
-                <w:sz w:val="20"/>
-                <w:szCs w:val="20"/>
-              </w:rPr>
-              <w:t xml:space="preserve">CoQ10 — warfarin interaction risk</w:t>
-            </w:r>
-          </w:p>
-        </w:tc>
-        <w:tc>
-          <w:tcPr>
-            <w:tcW w:type="dxa" w:w="4151"/>
-            <w:tcBorders>
-              <w:top w:val="single" w:color="CCCCCC" w:sz="4"/>
-              <w:left w:val="single" w:color="CCCCCC" w:sz="4"/>
-              <w:bottom w:val="single" w:color="CCCCCC" w:sz="4"/>
-              <w:right w:val="single" w:color="CCCCCC" w:sz="4"/>
-            </w:tcBorders>
-            <w:tcMar>
-              <w:top w:type="dxa" w:w="100"/>
-              <w:left w:type="dxa" w:w="140"/>
-              <w:bottom w:type="dxa" w:w="100"/>
-              <w:right w:type="dxa" w:w="140"/>
-            </w:tcMar>
-          </w:tcPr>
-          <w:p>
-            <w:r>
-              <w:rPr>
-                <w:rFonts w:ascii="Roboto" w:cs="Roboto" w:eastAsia="Roboto" w:hAnsi="Roboto"/>
-                <w:b w:val="false"/>
-                <w:bCs w:val="false"/>
-                <w:color w:val="000000"/>
-                <w:sz w:val="20"/>
-                <w:szCs w:val="20"/>
-              </w:rPr>
-              <w:t xml:space="preserve">TGA-required label warning notes caution with warfarin therapy. Confirm patient is not on anticoagulants before recommending.</w:t>
-            </w:r>
-          </w:p>
-        </w:tc>
-        <w:tc>
-          <w:tcPr>
-            <w:tcW w:type="dxa" w:w="1624"/>
-            <w:tcBorders>
-              <w:top w:val="single" w:color="CCCCCC" w:sz="4"/>
-              <w:left w:val="single" w:color="CCCCCC" w:sz="4"/>
-              <w:bottom w:val="single" w:color="CCCCCC" w:sz="4"/>
-              <w:right w:val="single" w:color="CCCCCC" w:sz="4"/>
-            </w:tcBorders>
-            <w:tcMar>
-              <w:top w:type="dxa" w:w="100"/>
-              <w:left w:type="dxa" w:w="140"/>
-              <w:bottom w:type="dxa" w:w="100"/>
-              <w:right w:type="dxa" w:w="140"/>
-            </w:tcMar>
-          </w:tcPr>
-          <w:p>
-            <w:r>
-              <w:rPr>
-                <w:rFonts w:ascii="Roboto" w:cs="Roboto" w:eastAsia="Roboto" w:hAnsi="Roboto"/>
-                <w:b w:val="false"/>
-                <w:bCs w:val="false"/>
-                <w:color w:val="000000"/>
-                <w:sz w:val="20"/>
-                <w:szCs w:val="20"/>
-              </w:rPr>
-              <w:t xml:space="preserve">Coenzyme Q10</w:t>
+              <w:t xml:space="preserve">Turmeric (Curcumin), Resveratrol, Quercetin, Zinc citrate, Ashwagandha, Magnesium glycinate</w:t>
             </w:r>
           </w:p>
         </w:tc>
@@ -4126,7 +3528,7 @@
                 <w:sz w:val="20"/>
                 <w:szCs w:val="20"/>
               </w:rPr>
-              <w:t xml:space="preserve">Vitamin B6 peripheral neuropathy</w:t>
+              <w:t xml:space="preserve">renal_function_mildly_reduced</w:t>
             </w:r>
           </w:p>
         </w:tc>
@@ -4156,7 +3558,7 @@
                 <w:sz w:val="20"/>
                 <w:szCs w:val="20"/>
               </w:rPr>
-              <w:t xml:space="preserve">TGA-required label warning advises monitoring for tingling, burning, or numbness with vitamin B6 use. Dose in this formulation is conservative (10 mg pyridoxine equivalent) and well below regulatory thresholds, but the practitioner may wish to monitor on follow-up.</w:t>
+              <w:t xml:space="preserve">eGFR 67 mL/min/1.73m² is below reference (&gt;90) but above the 30 mL/min/1.73m² hard-refusal threshold. The practitioner may wish to review renal function at follow-up, and adjust magnesium and any mineral doses if renal function further declines.</w:t>
             </w:r>
           </w:p>
         </w:tc>
@@ -4186,7 +3588,7 @@
                 <w:sz w:val="20"/>
                 <w:szCs w:val="20"/>
               </w:rPr>
-              <w:t xml:space="preserve">Vitamin B6 (P5P)</w:t>
+              <w:t xml:space="preserve">Magnesium glycinate, Zinc citrate</w:t>
             </w:r>
           </w:p>
         </w:tc>
@@ -4218,7 +3620,7 @@
                 <w:sz w:val="20"/>
                 <w:szCs w:val="20"/>
               </w:rPr>
-              <w:t xml:space="preserve">monitor</w:t>
+              <w:t xml:space="preserve">informational</w:t>
             </w:r>
           </w:p>
         </w:tc>
@@ -4248,7 +3650,7 @@
                 <w:sz w:val="20"/>
                 <w:szCs w:val="20"/>
               </w:rPr>
-              <w:t xml:space="preserve">Long-term zinc and copper status</w:t>
+              <w:t xml:space="preserve">patient_sex_discrepancy</w:t>
             </w:r>
           </w:p>
         </w:tc>
@@ -4278,7 +3680,7 @@
                 <w:sz w:val="20"/>
                 <w:szCs w:val="20"/>
               </w:rPr>
-              <w:t xml:space="preserve">Zinc at 25 mg elemental long-term (&gt;3 months) warrants practitioner consideration of copper status per standard frameworks. Re-test or clinical review at appropriate intervals.</w:t>
+              <w:t xml:space="preserve">The submission metadata records patient sex assigned at birth as female, however the attached NutriPath report is labelled 'Male'. The practitioner may wish to confirm patient sex before dispensing, as this affects hormone metabolism context and reference ranges for sex hormones (testosterone 21.0 nmol/L, SHBG 44 nmol/L, calculated free testosterone 427.6 pmol/L are shown against unspecified ranges). The FBP-class biomarkers used for this formulation are not sex-differential in reference range.</w:t>
             </w:r>
           </w:p>
         </w:tc>
@@ -4308,7 +3710,7 @@
                 <w:sz w:val="20"/>
                 <w:szCs w:val="20"/>
               </w:rPr>
-              <w:t xml:space="preserve">Zinc citrate</w:t>
+              <w:t xml:space="preserve">—</w:t>
             </w:r>
           </w:p>
         </w:tc>
@@ -4370,7 +3772,7 @@
                 <w:sz w:val="20"/>
                 <w:szCs w:val="20"/>
               </w:rPr>
-              <w:t xml:space="preserve">Iodine — binding exclusion applied</w:t>
+              <w:t xml:space="preserve">cu_zn_ratio_upper_limit_and_low_zinc</w:t>
             </w:r>
           </w:p>
         </w:tc>
@@ -4400,7 +3802,7 @@
                 <w:sz w:val="20"/>
                 <w:szCs w:val="20"/>
               </w:rPr>
-              <w:t xml:space="preserve">Iodine above 150 mcg not included given absence of thyroid antibody data on this panel. No iodine included in formulation as no thyroid driver is activated.</w:t>
+              <w:t xml:space="preserve">Copper excluded per binding rule; zinc citrate included to lower the ratio. Practitioner to retest Cu:Zn and plasma zinc after ~12 weeks.</w:t>
             </w:r>
           </w:p>
         </w:tc>
@@ -4465,7 +3867,7 @@
           <w:sz w:val="22"/>
           <w:szCs w:val="22"/>
         </w:rPr>
-        <w:t xml:space="preserve">1 binding exclusion(s) applied. These are ingredients held out of the pod because the panel does not measure the data needed to confirm safety, or the panel data crossed a hard exclusion threshold.</w:t>
+        <w:t xml:space="preserve">3 binding exclusion(s) applied. These are ingredients held out of the pod because the panel does not measure the data needed to confirm safety, or the panel data crossed a hard exclusion threshold.</w:t>
       </w:r>
     </w:p>
     <w:tbl>
@@ -4670,7 +4072,191 @@
                 <w:sz w:val="20"/>
                 <w:szCs w:val="20"/>
               </w:rPr>
-              <w:t xml:space="preserve">Per the standard binding-exclusion floor, iodine doses above 150 mcg would require negative thyroid antibody confirmation. As the panel does not address this and no thyroid driver is active, iodine is excluded from the formulation entirely.</w:t>
+              <w:t xml:space="preserve">Copper is excluded from the formulation. The clinical move is zinc repletion (which lowers the Cu:Zn ratio) without added copper. The practitioner may wish to re-check the ratio after 3 months of zinc supplementation.</w:t>
+            </w:r>
+          </w:p>
+        </w:tc>
+      </w:tr>
+      <w:tr>
+        <w:tc>
+          <w:tcPr>
+            <w:tcW w:type="dxa" w:w="1985"/>
+            <w:tcBorders>
+              <w:top w:val="single" w:color="CCCCCC" w:sz="4"/>
+              <w:left w:val="single" w:color="CCCCCC" w:sz="4"/>
+              <w:bottom w:val="single" w:color="CCCCCC" w:sz="4"/>
+              <w:right w:val="single" w:color="CCCCCC" w:sz="4"/>
+            </w:tcBorders>
+            <w:tcMar>
+              <w:top w:type="dxa" w:w="100"/>
+              <w:left w:type="dxa" w:w="140"/>
+              <w:bottom w:type="dxa" w:w="100"/>
+              <w:right w:type="dxa" w:w="140"/>
+            </w:tcMar>
+          </w:tcPr>
+          <w:p>
+            <w:r>
+              <w:rPr>
+                <w:rFonts w:ascii="Roboto" w:cs="Roboto" w:eastAsia="Roboto" w:hAnsi="Roboto"/>
+                <w:b/>
+                <w:bCs/>
+                <w:color w:val="000000"/>
+                <w:sz w:val="20"/>
+                <w:szCs w:val="20"/>
+              </w:rPr>
+              <w:t xml:space="preserve">—</w:t>
+            </w:r>
+          </w:p>
+        </w:tc>
+        <w:tc>
+          <w:tcPr>
+            <w:tcW w:type="dxa" w:w="3429"/>
+            <w:tcBorders>
+              <w:top w:val="single" w:color="CCCCCC" w:sz="4"/>
+              <w:left w:val="single" w:color="CCCCCC" w:sz="4"/>
+              <w:bottom w:val="single" w:color="CCCCCC" w:sz="4"/>
+              <w:right w:val="single" w:color="CCCCCC" w:sz="4"/>
+            </w:tcBorders>
+            <w:tcMar>
+              <w:top w:type="dxa" w:w="100"/>
+              <w:left w:type="dxa" w:w="140"/>
+              <w:bottom w:type="dxa" w:w="100"/>
+              <w:right w:type="dxa" w:w="140"/>
+            </w:tcMar>
+          </w:tcPr>
+          <w:p>
+            <w:r>
+              <w:rPr>
+                <w:rFonts w:ascii="Roboto" w:cs="Roboto" w:eastAsia="Roboto" w:hAnsi="Roboto"/>
+                <w:b w:val="false"/>
+                <w:bCs w:val="false"/>
+                <w:color w:val="000000"/>
+                <w:sz w:val="20"/>
+                <w:szCs w:val="20"/>
+              </w:rPr>
+              <w:t xml:space="preserve">—</w:t>
+            </w:r>
+          </w:p>
+        </w:tc>
+        <w:tc>
+          <w:tcPr>
+            <w:tcW w:type="dxa" w:w="3610"/>
+            <w:tcBorders>
+              <w:top w:val="single" w:color="CCCCCC" w:sz="4"/>
+              <w:left w:val="single" w:color="CCCCCC" w:sz="4"/>
+              <w:bottom w:val="single" w:color="CCCCCC" w:sz="4"/>
+              <w:right w:val="single" w:color="CCCCCC" w:sz="4"/>
+            </w:tcBorders>
+            <w:tcMar>
+              <w:top w:type="dxa" w:w="100"/>
+              <w:left w:type="dxa" w:w="140"/>
+              <w:bottom w:type="dxa" w:w="100"/>
+              <w:right w:type="dxa" w:w="140"/>
+            </w:tcMar>
+          </w:tcPr>
+          <w:p>
+            <w:r>
+              <w:rPr>
+                <w:rFonts w:ascii="Roboto" w:cs="Roboto" w:eastAsia="Roboto" w:hAnsi="Roboto"/>
+                <w:b w:val="false"/>
+                <w:bCs w:val="false"/>
+                <w:color w:val="000000"/>
+                <w:sz w:val="20"/>
+                <w:szCs w:val="20"/>
+              </w:rPr>
+              <w:t xml:space="preserve">Selenium is excluded from the formulation as RBC selenium is at the upper reference. Selenosis is cumulative and this level does not support additional supplementation. Dietary selenium may still be discussed with the patient.</w:t>
+            </w:r>
+          </w:p>
+        </w:tc>
+      </w:tr>
+      <w:tr>
+        <w:tc>
+          <w:tcPr>
+            <w:tcW w:type="dxa" w:w="1985"/>
+            <w:tcBorders>
+              <w:top w:val="single" w:color="CCCCCC" w:sz="4"/>
+              <w:left w:val="single" w:color="CCCCCC" w:sz="4"/>
+              <w:bottom w:val="single" w:color="CCCCCC" w:sz="4"/>
+              <w:right w:val="single" w:color="CCCCCC" w:sz="4"/>
+            </w:tcBorders>
+            <w:tcMar>
+              <w:top w:type="dxa" w:w="100"/>
+              <w:left w:type="dxa" w:w="140"/>
+              <w:bottom w:type="dxa" w:w="100"/>
+              <w:right w:type="dxa" w:w="140"/>
+            </w:tcMar>
+          </w:tcPr>
+          <w:p>
+            <w:r>
+              <w:rPr>
+                <w:rFonts w:ascii="Roboto" w:cs="Roboto" w:eastAsia="Roboto" w:hAnsi="Roboto"/>
+                <w:b/>
+                <w:bCs/>
+                <w:color w:val="000000"/>
+                <w:sz w:val="20"/>
+                <w:szCs w:val="20"/>
+              </w:rPr>
+              <w:t xml:space="preserve">—</w:t>
+            </w:r>
+          </w:p>
+        </w:tc>
+        <w:tc>
+          <w:tcPr>
+            <w:tcW w:type="dxa" w:w="3429"/>
+            <w:tcBorders>
+              <w:top w:val="single" w:color="CCCCCC" w:sz="4"/>
+              <w:left w:val="single" w:color="CCCCCC" w:sz="4"/>
+              <w:bottom w:val="single" w:color="CCCCCC" w:sz="4"/>
+              <w:right w:val="single" w:color="CCCCCC" w:sz="4"/>
+            </w:tcBorders>
+            <w:tcMar>
+              <w:top w:type="dxa" w:w="100"/>
+              <w:left w:type="dxa" w:w="140"/>
+              <w:bottom w:type="dxa" w:w="100"/>
+              <w:right w:type="dxa" w:w="140"/>
+            </w:tcMar>
+          </w:tcPr>
+          <w:p>
+            <w:r>
+              <w:rPr>
+                <w:rFonts w:ascii="Roboto" w:cs="Roboto" w:eastAsia="Roboto" w:hAnsi="Roboto"/>
+                <w:b w:val="false"/>
+                <w:bCs w:val="false"/>
+                <w:color w:val="000000"/>
+                <w:sz w:val="20"/>
+                <w:szCs w:val="20"/>
+              </w:rPr>
+              <w:t xml:space="preserve">—</w:t>
+            </w:r>
+          </w:p>
+        </w:tc>
+        <w:tc>
+          <w:tcPr>
+            <w:tcW w:type="dxa" w:w="3610"/>
+            <w:tcBorders>
+              <w:top w:val="single" w:color="CCCCCC" w:sz="4"/>
+              <w:left w:val="single" w:color="CCCCCC" w:sz="4"/>
+              <w:bottom w:val="single" w:color="CCCCCC" w:sz="4"/>
+              <w:right w:val="single" w:color="CCCCCC" w:sz="4"/>
+            </w:tcBorders>
+            <w:tcMar>
+              <w:top w:type="dxa" w:w="100"/>
+              <w:left w:type="dxa" w:w="140"/>
+              <w:bottom w:type="dxa" w:w="100"/>
+              <w:right w:type="dxa" w:w="140"/>
+            </w:tcMar>
+          </w:tcPr>
+          <w:p>
+            <w:r>
+              <w:rPr>
+                <w:rFonts w:ascii="Roboto" w:cs="Roboto" w:eastAsia="Roboto" w:hAnsi="Roboto"/>
+                <w:b w:val="false"/>
+                <w:bCs w:val="false"/>
+                <w:color w:val="000000"/>
+                <w:sz w:val="20"/>
+                <w:szCs w:val="20"/>
+              </w:rPr>
+              <w:t xml:space="preserve">Iron is not indicated. Iron status is more than adequate; supplementation would risk iron overload trajectory.</w:t>
             </w:r>
           </w:p>
         </w:tc>
@@ -4708,7 +4294,7 @@
           <w:sz w:val="22"/>
           <w:szCs w:val="22"/>
         </w:rPr>
-        <w:t xml:space="preserve">Re-testing of priority markers at a clinically appropriate interval determined by the treating practitioner may be considered to monitor response. Given the HPA-hypocortisolism pattern and oestrogen metabolism findings, urinary cortisol, oestrogen metabolites (particularly 2-OH Estrone and the 2:16 ratio), and symptom progression are the most informative monitoring points.</w:t>
+        <w:t xml:space="preserve">A re-test of priority markers may be considered by the practitioner at a clinically appropriate interval — commonly 12 weeks after commencing the formulation. Priority markers include hsCRP, FT3, Reverse T3, FT3:RT3 ratio, Cu:Zn ratio, plasma zinc, RBC selenium (for surveillance since RBC Se is at upper reference), eGFR, and blood aluminium / lead.</w:t>
       </w:r>
     </w:p>
     <w:p>
@@ -4749,7 +4335,7 @@
           <w:sz w:val="20"/>
           <w:szCs w:val="20"/>
         </w:rPr>
-        <w:t xml:space="preserve">Total 24hr urinary cortisol — response to adaptogenic/B5 support</w:t>
+        <w:t xml:space="preserve">hsCRP</w:t>
       </w:r>
     </w:p>
     <w:p>
@@ -4774,7 +4360,7 @@
           <w:sz w:val="20"/>
           <w:szCs w:val="20"/>
         </w:rPr>
-        <w:t xml:space="preserve">2-OH Estrone and 2-OH(E1+E2)/16-OHE1 ratio — response to DIM and oestrogen metabolism support</w:t>
+        <w:t xml:space="preserve">FT3, Reverse T3, FT3:RT3 ratio</w:t>
       </w:r>
     </w:p>
     <w:p>
@@ -4799,7 +4385,7 @@
           <w:sz w:val="20"/>
           <w:szCs w:val="20"/>
         </w:rPr>
-        <w:t xml:space="preserve">2-MeOH metabolites — response to methylation cofactor and DIM stack</w:t>
+        <w:t xml:space="preserve">Plasma zinc and Cu:Zn ratio</w:t>
       </w:r>
     </w:p>
     <w:p>
@@ -4824,7 +4410,7 @@
           <w:sz w:val="20"/>
           <w:szCs w:val="20"/>
         </w:rPr>
-        <w:t xml:space="preserve">Estrogen Quotient E3/(E1+E2) — response to overall oestrogen metabolism support</w:t>
+        <w:t xml:space="preserve">RBC selenium (surveillance)</w:t>
       </w:r>
     </w:p>
     <w:p>
@@ -4849,7 +4435,7 @@
           <w:sz w:val="20"/>
           <w:szCs w:val="20"/>
         </w:rPr>
-        <w:t xml:space="preserve">DHEA — concurrent HPA marker</w:t>
+        <w:t xml:space="preserve">eGFR / renal function</w:t>
       </w:r>
     </w:p>
     <w:p>
@@ -4874,7 +4460,7 @@
           <w:sz w:val="20"/>
           <w:szCs w:val="20"/>
         </w:rPr>
-        <w:t xml:space="preserve">Clinical symptom score across HPA-related items (fatigue, sleep, stress tolerance)</w:t>
+        <w:t xml:space="preserve">Fasting glucose and lipid panel (VLDL)</w:t>
       </w:r>
     </w:p>
     <w:p>
@@ -4899,7 +4485,7 @@
           <w:sz w:val="20"/>
           <w:szCs w:val="20"/>
         </w:rPr>
-        <w:t xml:space="preserve">If long-term zinc supplementation continues, copper status</w:t>
+        <w:t xml:space="preserve">Blood aluminium and lead</w:t>
       </w:r>
     </w:p>
     <w:p>
@@ -4924,7 +4510,7 @@
           <w:sz w:val="20"/>
           <w:szCs w:val="20"/>
         </w:rPr>
-        <w:t xml:space="preserve">25-OH vitamin D if not recently assessed</w:t>
+        <w:t xml:space="preserve">Fibrinogen</w:t>
       </w:r>
     </w:p>
     <w:p>
@@ -4940,7 +4526,7 @@
           <w:sz w:val="20"/>
           <w:szCs w:val="20"/>
         </w:rPr>
-        <w:t xml:space="preserve">Timing of any follow-up testing is for the treating practitioner to determine based on clinical response and patient context.</w:t>
+        <w:t xml:space="preserve">Re-testing timing is a clinical option determined by the treating practitioner.</w:t>
       </w:r>
     </w:p>
     <w:p>
@@ -4975,7 +4561,7 @@
           <w:sz w:val="22"/>
           <w:szCs w:val="22"/>
         </w:rPr>
-        <w:t xml:space="preserve">The following 5 finding(s) on this panel are within reference and are surfaced as areas of clinical strength to contextualise the abnormal findings above.</w:t>
+        <w:t xml:space="preserve">The following 8 finding(s) on this panel are within reference and are surfaced as areas of clinical strength to contextualise the abnormal findings above.</w:t>
       </w:r>
     </w:p>
     <w:p>
@@ -5000,7 +4586,7 @@
           <w:sz w:val="20"/>
           <w:szCs w:val="20"/>
         </w:rPr>
-        <w:t xml:space="preserve">Endocrine disruptor panel — BPA, PFAS, PFOA, PFOS and heavy metals (Al, As, Cd, Cr, Pb, Hg, Ni) all below or near detection limits within reference, indicating no environmental exposure burden identified on this panel.</w:t>
+        <w:t xml:space="preserve">Thyroid antibodies (TPO, Tg, TRAb) all negative — no autoimmune thyroid pattern.</w:t>
       </w:r>
     </w:p>
     <w:p>
@@ -5025,7 +4611,7 @@
           <w:sz w:val="20"/>
           <w:szCs w:val="20"/>
         </w:rPr>
-        <w:t xml:space="preserve">4-OH Estradiol below detection and 4-OH Estrone at lower reference limit — pattern consistent with low genotoxic catechol oestrogen output per laboratory framework.</w:t>
+        <w:t xml:space="preserve">Homocysteine 8.1 µmol/L, activated B12 91.3, serum folate 19 — methylation cycle indicators adequate.</w:t>
       </w:r>
     </w:p>
     <w:p>
@@ -5050,7 +4636,7 @@
           <w:sz w:val="20"/>
           <w:szCs w:val="20"/>
         </w:rPr>
-        <w:t xml:space="preserve">Elevated 4-MeOH E2/4-OH E2 ratio (4.39) — pattern consistent with active methylation of the 4-OH branch per laboratory comment.</w:t>
+        <w:t xml:space="preserve">LDL Pattern A (normal), LDL 2.8 mmol/L, mean particle size 274 Å — favourable lipoprotein profile despite mildly elevated VLDL.</w:t>
       </w:r>
     </w:p>
     <w:p>
@@ -5075,7 +4661,7 @@
           <w:sz w:val="20"/>
           <w:szCs w:val="20"/>
         </w:rPr>
-        <w:t xml:space="preserve">Testosterone, DHEA-S, and Pregnanediol within laboratory reference ranges.</w:t>
+        <w:t xml:space="preserve">Iron status adequate — ferritin 243, transferrin saturation 32%.</w:t>
       </w:r>
     </w:p>
     <w:p>
@@ -5100,7 +4686,82 @@
           <w:sz w:val="20"/>
           <w:szCs w:val="20"/>
         </w:rPr>
-        <w:t xml:space="preserve">Absolute Estradiol, Estrone, and Estriol values each individually within the laboratory reference range — the oestrogen quotient finding reflects relative balance rather than absolute deficit or excess.</w:t>
+        <w:t xml:space="preserve">TSH 1.95 mIU/L, Free T4 14.6 pmol/L — central thyroid regulation intact.</w:t>
+      </w:r>
+    </w:p>
+    <w:p>
+      <w:pPr>
+        <w:spacing w:after="60"/>
+      </w:pPr>
+      <w:r>
+        <w:rPr>
+          <w:rFonts w:ascii="Roboto" w:cs="Roboto" w:eastAsia="Roboto" w:hAnsi="Roboto"/>
+          <w:b/>
+          <w:bCs/>
+          <w:color w:val="C3AF88"/>
+          <w:sz w:val="22"/>
+          <w:szCs w:val="22"/>
+        </w:rPr>
+        <w:t xml:space="preserve">• </w:t>
+      </w:r>
+      <w:r>
+        <w:rPr>
+          <w:rFonts w:ascii="Roboto" w:cs="Roboto" w:eastAsia="Roboto" w:hAnsi="Roboto"/>
+          <w:color w:val="000000"/>
+          <w:sz w:val="20"/>
+          <w:szCs w:val="20"/>
+        </w:rPr>
+        <w:t xml:space="preserve">Amino acid profile broadly within reference — essential AAs, BCAA total 471, no catabolic pattern.</w:t>
+      </w:r>
+    </w:p>
+    <w:p>
+      <w:pPr>
+        <w:spacing w:after="60"/>
+      </w:pPr>
+      <w:r>
+        <w:rPr>
+          <w:rFonts w:ascii="Roboto" w:cs="Roboto" w:eastAsia="Roboto" w:hAnsi="Roboto"/>
+          <w:b/>
+          <w:bCs/>
+          <w:color w:val="C3AF88"/>
+          <w:sz w:val="22"/>
+          <w:szCs w:val="22"/>
+        </w:rPr>
+        <w:t xml:space="preserve">• </w:t>
+      </w:r>
+      <w:r>
+        <w:rPr>
+          <w:rFonts w:ascii="Roboto" w:cs="Roboto" w:eastAsia="Roboto" w:hAnsi="Roboto"/>
+          <w:color w:val="000000"/>
+          <w:sz w:val="20"/>
+          <w:szCs w:val="20"/>
+        </w:rPr>
+        <w:t xml:space="preserve">No heavy metal above reference threshold — burden is mild.</w:t>
+      </w:r>
+    </w:p>
+    <w:p>
+      <w:pPr>
+        <w:spacing w:after="60"/>
+      </w:pPr>
+      <w:r>
+        <w:rPr>
+          <w:rFonts w:ascii="Roboto" w:cs="Roboto" w:eastAsia="Roboto" w:hAnsi="Roboto"/>
+          <w:b/>
+          <w:bCs/>
+          <w:color w:val="C3AF88"/>
+          <w:sz w:val="22"/>
+          <w:szCs w:val="22"/>
+        </w:rPr>
+        <w:t xml:space="preserve">• </w:t>
+      </w:r>
+      <w:r>
+        <w:rPr>
+          <w:rFonts w:ascii="Roboto" w:cs="Roboto" w:eastAsia="Roboto" w:hAnsi="Roboto"/>
+          <w:color w:val="000000"/>
+          <w:sz w:val="20"/>
+          <w:szCs w:val="20"/>
+        </w:rPr>
+        <w:t xml:space="preserve">Cortisol OA 19.7 ug/gCR — HPA axis within reference.</w:t>
       </w:r>
     </w:p>
     <w:p>
@@ -5160,7 +4821,7 @@
           <w:sz w:val="22"/>
           <w:szCs w:val="22"/>
         </w:rPr>
-        <w:t xml:space="preserve">  Dalessandri et al. (2004). Pilot study: effect of 3,3'-diindolylmethane supplements on urinary hormone metabolites in postmenopausal women with a history of early-stage breast cancer. Nutrition and Cancer.</w:t>
+        <w:t xml:space="preserve">  Sahebkar A et al. (2016). Curcuminoids modify the concentration of C-reactive protein: a systematic review and meta-analysis of randomized controlled trials. Pharmacological Research.</w:t>
       </w:r>
       <w:r>
         <w:rPr>
@@ -5171,7 +4832,7 @@
           <w:sz w:val="18"/>
           <w:szCs w:val="18"/>
         </w:rPr>
-        <w:t xml:space="preserve">  (DIM (3,3'-diindolylmethane))</w:t>
+        <w:t xml:space="preserve">  (Turmeric (Curcumin))</w:t>
       </w:r>
     </w:p>
     <w:p>
@@ -5196,7 +4857,7 @@
           <w:sz w:val="22"/>
           <w:szCs w:val="22"/>
         </w:rPr>
-        <w:t xml:space="preserve">  Walaszek et al. (1990). Dietary glucarate-mediated reduction of sensitivity of murine strains to chemical carcinogenesis. Cancer Letters.</w:t>
+        <w:t xml:space="preserve">  Yu G et al. (2020). Effectiveness of Boswellia and Boswellia extract for osteoarthritis patients: a systematic review and meta-analysis. BMC Complementary Medicine and Therapies.</w:t>
       </w:r>
       <w:r>
         <w:rPr>
@@ -5207,7 +4868,7 @@
           <w:sz w:val="18"/>
           <w:szCs w:val="18"/>
         </w:rPr>
-        <w:t xml:space="preserve">  (Calcium D-glucarate)</w:t>
+        <w:t xml:space="preserve">  (Boswellia (Frankincense))</w:t>
       </w:r>
     </w:p>
     <w:p>
@@ -5232,7 +4893,7 @@
           <w:sz w:val="22"/>
           <w:szCs w:val="22"/>
         </w:rPr>
-        <w:t xml:space="preserve">  Abenavoli et al. (2018). Milk thistle (Silybum marianum): A concise overview on its chemistry, pharmacological, and nutraceutical uses in liver diseases. Phytotherapy Research.</w:t>
+        <w:t xml:space="preserve">  Mohammadi-Sartang M et al. (2017). Effects of supplementation with quercetin on plasma C-reactive protein concentrations: a systematic review and meta-analysis of randomized controlled trials. European Journal of Clinical Nutrition.</w:t>
       </w:r>
       <w:r>
         <w:rPr>
@@ -5243,7 +4904,7 @@
           <w:sz w:val="18"/>
           <w:szCs w:val="18"/>
         </w:rPr>
-        <w:t xml:space="preserve">  (Milk thistle (silymarin))</w:t>
+        <w:t xml:space="preserve">  (Quercetin)</w:t>
       </w:r>
     </w:p>
     <w:p>
@@ -5268,7 +4929,7 @@
           <w:sz w:val="22"/>
           <w:szCs w:val="22"/>
         </w:rPr>
-        <w:t xml:space="preserve">  Chow et al. (2010). Resveratrol modulates drug- and carcinogen-metabolizing enzymes in a healthy volunteer study. Cancer Prevention Research.</w:t>
+        <w:t xml:space="preserve">  Koushki M et al. (2018). Effect of Resveratrol Supplementation on Inflammatory Markers: A Systematic Review and Meta-Analysis of Randomized Controlled Trials. Clinical Therapeutics.</w:t>
       </w:r>
       <w:r>
         <w:rPr>
@@ -5304,7 +4965,7 @@
           <w:sz w:val="22"/>
           <w:szCs w:val="22"/>
         </w:rPr>
-        <w:t xml:space="preserve">  Chandrasekhar et al. (2012). A prospective, randomized double-blind, placebo-controlled study of safety and efficacy of a high-concentration full-spectrum extract of ashwagandha root in reducing stress and anxiety in adults. Indian Journal of Psychological Medicine.</w:t>
+        <w:t xml:space="preserve">  Kasperczyk S et al. (2013). The effect of N-acetylcysteine supplementation on blood lead concentration and oxidative stress in lead-exposed workers. Biological Trace Element Research.</w:t>
       </w:r>
       <w:r>
         <w:rPr>
@@ -5315,7 +4976,7 @@
           <w:sz w:val="18"/>
           <w:szCs w:val="18"/>
         </w:rPr>
-        <w:t xml:space="preserve">  (Ashwagandha)</w:t>
+        <w:t xml:space="preserve">  (N-acetyl cysteine (NAC))</w:t>
       </w:r>
     </w:p>
     <w:p>
@@ -5340,7 +5001,7 @@
           <w:sz w:val="22"/>
           <w:szCs w:val="22"/>
         </w:rPr>
-        <w:t xml:space="preserve">  Olsson et al. (2009). A randomised, double-blind, placebo-controlled, parallel-group study of the standardised extract SHR-5 of the roots of Rhodiola rosea in the treatment of subjects with stress-related fatigue. Planta Medica.</w:t>
+        <w:t xml:space="preserve">  Richie JP et al. (2015). Randomized controlled trial of oral glutathione supplementation on body stores of glutathione. European Journal of Nutrition.</w:t>
       </w:r>
       <w:r>
         <w:rPr>
@@ -5351,7 +5012,7 @@
           <w:sz w:val="18"/>
           <w:szCs w:val="18"/>
         </w:rPr>
-        <w:t xml:space="preserve">  (Rhodiola)</w:t>
+        <w:t xml:space="preserve">  (Glutathione (S-acetyl))</w:t>
       </w:r>
     </w:p>
     <w:p>
@@ -5376,7 +5037,7 @@
           <w:sz w:val="22"/>
           <w:szCs w:val="22"/>
         </w:rPr>
-        <w:t xml:space="preserve">  Scholey et al. (2010). Effects of American ginseng (Panax quinquefolius) on neurocognitive function: an acute, randomised, double-blind, placebo-controlled, crossover study. Psychopharmacology.</w:t>
+        <w:t xml:space="preserve">  Akbari M et al. (2018). The effects of alpha-lipoic acid supplementation on glucose control and lipid profiles among patients with metabolic diseases: A systematic review and meta-analysis of randomized controlled trials. Metabolism.</w:t>
       </w:r>
       <w:r>
         <w:rPr>
@@ -5387,7 +5048,7 @@
           <w:sz w:val="18"/>
           <w:szCs w:val="18"/>
         </w:rPr>
-        <w:t xml:space="preserve">  (American ginseng (Panax quinquefolius))</w:t>
+        <w:t xml:space="preserve">  (Alpha-lipoic acid)</w:t>
       </w:r>
     </w:p>
     <w:p>
@@ -5412,7 +5073,7 @@
           <w:sz w:val="22"/>
           <w:szCs w:val="22"/>
         </w:rPr>
-        <w:t xml:space="preserve">  Mizuno et al. (2008). Antifatigue effects of coenzyme Q10 during physical fatigue. Nutrition.</w:t>
+        <w:t xml:space="preserve">  Gholami M et al. (2017). The effect of silymarin on blood lead levels in lead-exposed workers: a randomized controlled trial. Journal of Trace Elements in Medicine and Biology.</w:t>
       </w:r>
       <w:r>
         <w:rPr>
@@ -5423,7 +5084,7 @@
           <w:sz w:val="18"/>
           <w:szCs w:val="18"/>
         </w:rPr>
-        <w:t xml:space="preserve">  (Coenzyme Q10)</w:t>
+        <w:t xml:space="preserve">  (Milk thistle (Silymarin))</w:t>
       </w:r>
     </w:p>
     <w:p>
@@ -5448,7 +5109,7 @@
           <w:sz w:val="22"/>
           <w:szCs w:val="22"/>
         </w:rPr>
-        <w:t xml:space="preserve">  Paul &amp; Brady (2017). Comparative bioavailability and utilization of particular forms of B12 supplements with potential to mitigate B12-related genetic polymorphisms. Integrative Medicine.</w:t>
+        <w:t xml:space="preserve">  Walaszek Z et al. (1997). D-Glucaric acid content of various fruits and vegetables and cholesterol-lowering effects of dietary D-glucarate in the rat. Nutrition Research.</w:t>
       </w:r>
       <w:r>
         <w:rPr>
@@ -5459,7 +5120,7 @@
           <w:sz w:val="18"/>
           <w:szCs w:val="18"/>
         </w:rPr>
-        <w:t xml:space="preserve">  (Vitamin B12 (methylcobalamin))</w:t>
+        <w:t xml:space="preserve">  (Calcium D-glucarate)</w:t>
       </w:r>
     </w:p>
     <w:p>
@@ -5484,7 +5145,7 @@
           <w:sz w:val="22"/>
           <w:szCs w:val="22"/>
         </w:rPr>
-        <w:t xml:space="preserve">  Xu et al. (2007). Plasma folate, vitamin B12, and one-carbon metabolism nutrients and risk of breast cancer in women. American Journal of Clinical Nutrition.</w:t>
+        <w:t xml:space="preserve">  Mantle D &amp; Hargreaves IP (2019). Coenzyme Q10 and Degenerative Disorders Affecting Longevity: An Overview. Antioxidants.</w:t>
       </w:r>
       <w:r>
         <w:rPr>
@@ -5495,7 +5156,7 @@
           <w:sz w:val="18"/>
           <w:szCs w:val="18"/>
         </w:rPr>
-        <w:t xml:space="preserve">  (Folate (as calcium folinate))</w:t>
+        <w:t xml:space="preserve">  (Coenzyme Q10)</w:t>
       </w:r>
     </w:p>
     <w:p>
@@ -5520,7 +5181,7 @@
           <w:sz w:val="22"/>
           <w:szCs w:val="22"/>
         </w:rPr>
-        <w:t xml:space="preserve">  Wu et al. (1999). Plasma pyridoxal 5'-phosphate is reduced in premenopausal women undergoing chemotherapy and influences one-carbon metabolism. Journal of Nutrition.</w:t>
+        <w:t xml:space="preserve">  Mollace V et al. (2011). Hypolipemic and hypoglycaemic activity of bergamot polyphenols: from animal models to human studies. Fitoterapia.</w:t>
       </w:r>
       <w:r>
         <w:rPr>
@@ -5531,7 +5192,7 @@
           <w:sz w:val="18"/>
           <w:szCs w:val="18"/>
         </w:rPr>
-        <w:t xml:space="preserve">  (Vitamin B6 (P5P))</w:t>
+        <w:t xml:space="preserve">  (Bergamot)</w:t>
       </w:r>
     </w:p>
     <w:p>
@@ -5556,7 +5217,7 @@
           <w:sz w:val="22"/>
           <w:szCs w:val="22"/>
         </w:rPr>
-        <w:t xml:space="preserve">  McNulty et al. (2017). Riboflavin, MTHFR genotype and blood pressure: A personalized approach to prevention and treatment of hypertension. Molecular Aspects of Medicine.</w:t>
+        <w:t xml:space="preserve">  Sharma AK et al. (2018). Efficacy and Safety of Ashwagandha Root Extract in Subclinical Hypothyroid Patients: A Double-Blind, Randomized Placebo-Controlled Trial. Journal of Alternative and Complementary Medicine.</w:t>
       </w:r>
       <w:r>
         <w:rPr>
@@ -5567,7 +5228,7 @@
           <w:sz w:val="18"/>
           <w:szCs w:val="18"/>
         </w:rPr>
-        <w:t xml:space="preserve">  (Riboflavin (B2))</w:t>
+        <w:t xml:space="preserve">  (Ashwagandha)</w:t>
       </w:r>
     </w:p>
     <w:p>
@@ -5592,7 +5253,7 @@
           <w:sz w:val="22"/>
           <w:szCs w:val="22"/>
         </w:rPr>
-        <w:t xml:space="preserve">  Jaroenporn et al. (2008). Effects of pantothenic acid supplementation on adrenal steroid secretion from male rats. Biological &amp; Pharmaceutical Bulletin.</w:t>
+        <w:t xml:space="preserve">  Panossian A et al. (2010). Rosenroot (Rhodiola rosea): Traditional use, chemical composition, pharmacology and clinical efficacy. Phytomedicine.</w:t>
       </w:r>
       <w:r>
         <w:rPr>
@@ -5603,7 +5264,7 @@
           <w:sz w:val="18"/>
           <w:szCs w:val="18"/>
         </w:rPr>
-        <w:t xml:space="preserve">  (Pantothenic acid (B5))</w:t>
+        <w:t xml:space="preserve">  (Rhodiola)</w:t>
       </w:r>
     </w:p>
     <w:p>
@@ -5628,7 +5289,7 @@
           <w:sz w:val="22"/>
           <w:szCs w:val="22"/>
         </w:rPr>
-        <w:t xml:space="preserve">  Kennedy (2016). B vitamins and the brain: Mechanisms, dose and efficacy—a review. Nutrients.</w:t>
+        <w:t xml:space="preserve">  Zimmermann MB (2009). Iodine deficiency. Endocrine Reviews.</w:t>
       </w:r>
       <w:r>
         <w:rPr>
@@ -5639,7 +5300,7 @@
           <w:sz w:val="18"/>
           <w:szCs w:val="18"/>
         </w:rPr>
-        <w:t xml:space="preserve">  (Nicotinamide (B3))</w:t>
+        <w:t xml:space="preserve">  (Potassium iodide (iodine))</w:t>
       </w:r>
     </w:p>
     <w:p>
@@ -5664,7 +5325,7 @@
           <w:sz w:val="22"/>
           <w:szCs w:val="22"/>
         </w:rPr>
-        <w:t xml:space="preserve">  Boyle et al. (2017). The effects of magnesium supplementation on subjective anxiety and stress—A systematic review. Nutrients.</w:t>
+        <w:t xml:space="preserve">  Mahmoodianfard S et al. (2015). Effects of Zinc and Selenium Supplementation on Thyroid Function in Overweight and Obese Hypothyroid Female Patients: A Randomized Double-Blind Controlled Trial. Journal of the American College of Nutrition.</w:t>
       </w:r>
       <w:r>
         <w:rPr>
@@ -5675,7 +5336,7 @@
           <w:sz w:val="18"/>
           <w:szCs w:val="18"/>
         </w:rPr>
-        <w:t xml:space="preserve">  (Magnesium glycinate)</w:t>
+        <w:t xml:space="preserve">  (Zinc citrate)</w:t>
       </w:r>
     </w:p>
     <w:p>
@@ -5700,7 +5361,7 @@
           <w:sz w:val="22"/>
           <w:szCs w:val="22"/>
         </w:rPr>
-        <w:t xml:space="preserve">  Prasad et al. (1996). Zinc status and serum testosterone levels of healthy adults. Nutrition.</w:t>
+        <w:t xml:space="preserve">  Schuchardt JP &amp; Hahn A (2017). Intestinal Absorption and Factors Influencing Bioavailability of Magnesium – An Update. Current Nutrition and Food Science.</w:t>
       </w:r>
       <w:r>
         <w:rPr>
@@ -5711,7 +5372,7 @@
           <w:sz w:val="18"/>
           <w:szCs w:val="18"/>
         </w:rPr>
-        <w:t xml:space="preserve">  (Zinc citrate)</w:t>
+        <w:t xml:space="preserve">  (Magnesium glycinate)</w:t>
       </w:r>
     </w:p>
     <w:p>
@@ -5736,7 +5397,7 @@
           <w:sz w:val="22"/>
           <w:szCs w:val="22"/>
         </w:rPr>
-        <w:t xml:space="preserve">  Cavalieri &amp; Rogan (2016). Depurinating estrogen-DNA adducts, generators of cancer initiation: their minimization leads to cancer prevention. Clinical and Translational Medicine.</w:t>
+        <w:t xml:space="preserve">  Ueland PM et al. (2015). Direct and Functional Biomarkers of Vitamin B6 Status. Annual Review of Nutrition.</w:t>
       </w:r>
       <w:r>
         <w:rPr>
@@ -5747,7 +5408,7 @@
           <w:sz w:val="18"/>
           <w:szCs w:val="18"/>
         </w:rPr>
-        <w:t xml:space="preserve">  (N-acetyl cysteine (NAC))</w:t>
+        <w:t xml:space="preserve">  (Vitamin B6 (P5P))</w:t>
       </w:r>
     </w:p>
     <w:p>
@@ -5772,7 +5433,7 @@
           <w:sz w:val="22"/>
           <w:szCs w:val="22"/>
         </w:rPr>
-        <w:t xml:space="preserve">  Zhu &amp; Liehr (1994). Quercetin increases the severity of estradiol-induced tumorigenesis in hamster kidney. Toxicology and Applied Pharmacology.</w:t>
+        <w:t xml:space="preserve">  Powers HJ (2003). Riboflavin (vitamin B-2) and health. American Journal of Clinical Nutrition.</w:t>
       </w:r>
       <w:r>
         <w:rPr>
@@ -5783,7 +5444,7 @@
           <w:sz w:val="18"/>
           <w:szCs w:val="18"/>
         </w:rPr>
-        <w:t xml:space="preserve">  (Quercetin)</w:t>
+        <w:t xml:space="preserve">  (Riboflavin (Vitamin B2))</w:t>
       </w:r>
     </w:p>
     <w:p>
@@ -5808,7 +5469,7 @@
           <w:sz w:val="22"/>
           <w:szCs w:val="22"/>
         </w:rPr>
-        <w:t xml:space="preserve">  Peters et al. (2001). Vitamin C supplementation attenuates the increases in circulating cortisol, adrenaline and anti-inflammatory polypeptides following ultramarathon running. International Journal of Sports Medicine.</w:t>
+        <w:t xml:space="preserve">  Trammell SAJ et al. (2016). Nicotinamide riboside is uniquely and orally bioavailable in mice and humans. Nature Communications.</w:t>
       </w:r>
       <w:r>
         <w:rPr>
@@ -5819,7 +5480,7 @@
           <w:sz w:val="18"/>
           <w:szCs w:val="18"/>
         </w:rPr>
-        <w:t xml:space="preserve">  (Vitamin C (ascorbic acid))</w:t>
+        <w:t xml:space="preserve">  (Nicotinamide (Vitamin B3))</w:t>
       </w:r>
     </w:p>
     <w:p>
@@ -5844,7 +5505,7 @@
           <w:sz w:val="22"/>
           <w:szCs w:val="22"/>
         </w:rPr>
-        <w:t xml:space="preserve">  Pilz et al. (2011). Effect of vitamin D supplementation on testosterone levels in men. Hormone and Metabolic Research.</w:t>
+        <w:t xml:space="preserve">  Miller JW &amp; Rucker RB (2020). Pantothenic Acid. In: Present Knowledge in Nutrition, 11th edition. Academic Press.</w:t>
       </w:r>
       <w:r>
         <w:rPr>
@@ -5855,7 +5516,187 @@
           <w:sz w:val="18"/>
           <w:szCs w:val="18"/>
         </w:rPr>
-        <w:t xml:space="preserve">  (Vitamin D3 (cholecalciferol))</w:t>
+        <w:t xml:space="preserve">  (Pantothenic acid (Vitamin B5))</w:t>
+      </w:r>
+    </w:p>
+    <w:p>
+      <w:pPr>
+        <w:spacing w:after="120"/>
+      </w:pPr>
+      <w:r>
+        <w:rPr>
+          <w:rFonts w:ascii="Roboto" w:cs="Roboto" w:eastAsia="Roboto" w:hAnsi="Roboto"/>
+          <w:b/>
+          <w:bCs/>
+          <w:color w:val="C3AF88"/>
+          <w:sz w:val="22"/>
+          <w:szCs w:val="22"/>
+        </w:rPr>
+        <w:t xml:space="preserve">[21]</w:t>
+      </w:r>
+      <w:r>
+        <w:rPr>
+          <w:rFonts w:ascii="Roboto" w:cs="Roboto" w:eastAsia="Roboto" w:hAnsi="Roboto"/>
+          <w:color w:val="000000"/>
+          <w:sz w:val="22"/>
+          <w:szCs w:val="22"/>
+        </w:rPr>
+        <w:t xml:space="preserve">  Whitfield KC et al. (2018). Thiamine deficiency disorders: diagnosis, prevalence, and a roadmap for global control programs. Annals of the New York Academy of Sciences.</w:t>
+      </w:r>
+      <w:r>
+        <w:rPr>
+          <w:rFonts w:ascii="Roboto" w:cs="Roboto" w:eastAsia="Roboto" w:hAnsi="Roboto"/>
+          <w:i/>
+          <w:iCs/>
+          <w:color w:val="000000"/>
+          <w:sz w:val="18"/>
+          <w:szCs w:val="18"/>
+        </w:rPr>
+        <w:t xml:space="preserve">  (Thiamine (Vitamin B1))</w:t>
+      </w:r>
+    </w:p>
+    <w:p>
+      <w:pPr>
+        <w:spacing w:after="120"/>
+      </w:pPr>
+      <w:r>
+        <w:rPr>
+          <w:rFonts w:ascii="Roboto" w:cs="Roboto" w:eastAsia="Roboto" w:hAnsi="Roboto"/>
+          <w:b/>
+          <w:bCs/>
+          <w:color w:val="C3AF88"/>
+          <w:sz w:val="22"/>
+          <w:szCs w:val="22"/>
+        </w:rPr>
+        <w:t xml:space="preserve">[22]</w:t>
+      </w:r>
+      <w:r>
+        <w:rPr>
+          <w:rFonts w:ascii="Roboto" w:cs="Roboto" w:eastAsia="Roboto" w:hAnsi="Roboto"/>
+          <w:color w:val="000000"/>
+          <w:sz w:val="22"/>
+          <w:szCs w:val="22"/>
+        </w:rPr>
+        <w:t xml:space="preserve">  Homocysteine Lowering Trialists' Collaboration (2005). Dose-dependent effects of folic acid on blood concentrations of homocysteine: a meta-analysis of the randomized trials. American Journal of Clinical Nutrition.</w:t>
+      </w:r>
+      <w:r>
+        <w:rPr>
+          <w:rFonts w:ascii="Roboto" w:cs="Roboto" w:eastAsia="Roboto" w:hAnsi="Roboto"/>
+          <w:i/>
+          <w:iCs/>
+          <w:color w:val="000000"/>
+          <w:sz w:val="18"/>
+          <w:szCs w:val="18"/>
+        </w:rPr>
+        <w:t xml:space="preserve">  (Methylcobalamin (Vitamin B12))</w:t>
+      </w:r>
+    </w:p>
+    <w:p>
+      <w:pPr>
+        <w:spacing w:after="120"/>
+      </w:pPr>
+      <w:r>
+        <w:rPr>
+          <w:rFonts w:ascii="Roboto" w:cs="Roboto" w:eastAsia="Roboto" w:hAnsi="Roboto"/>
+          <w:b/>
+          <w:bCs/>
+          <w:color w:val="C3AF88"/>
+          <w:sz w:val="22"/>
+          <w:szCs w:val="22"/>
+        </w:rPr>
+        <w:t xml:space="preserve">[23]</w:t>
+      </w:r>
+      <w:r>
+        <w:rPr>
+          <w:rFonts w:ascii="Roboto" w:cs="Roboto" w:eastAsia="Roboto" w:hAnsi="Roboto"/>
+          <w:color w:val="000000"/>
+          <w:sz w:val="22"/>
+          <w:szCs w:val="22"/>
+        </w:rPr>
+        <w:t xml:space="preserve">  Wald DS et al. (2002). Homocysteine and cardiovascular disease: evidence on causality from a meta-analysis. BMJ.</w:t>
+      </w:r>
+      <w:r>
+        <w:rPr>
+          <w:rFonts w:ascii="Roboto" w:cs="Roboto" w:eastAsia="Roboto" w:hAnsi="Roboto"/>
+          <w:i/>
+          <w:iCs/>
+          <w:color w:val="000000"/>
+          <w:sz w:val="18"/>
+          <w:szCs w:val="18"/>
+        </w:rPr>
+        <w:t xml:space="preserve">  (Calcium folinate (folate))</w:t>
+      </w:r>
+    </w:p>
+    <w:p>
+      <w:pPr>
+        <w:spacing w:after="120"/>
+      </w:pPr>
+      <w:r>
+        <w:rPr>
+          <w:rFonts w:ascii="Roboto" w:cs="Roboto" w:eastAsia="Roboto" w:hAnsi="Roboto"/>
+          <w:b/>
+          <w:bCs/>
+          <w:color w:val="C3AF88"/>
+          <w:sz w:val="22"/>
+          <w:szCs w:val="22"/>
+        </w:rPr>
+        <w:t xml:space="preserve">[24]</w:t>
+      </w:r>
+      <w:r>
+        <w:rPr>
+          <w:rFonts w:ascii="Roboto" w:cs="Roboto" w:eastAsia="Roboto" w:hAnsi="Roboto"/>
+          <w:color w:val="000000"/>
+          <w:sz w:val="22"/>
+          <w:szCs w:val="22"/>
+        </w:rPr>
+        <w:t xml:space="preserve">  Carr AC &amp; Maggini S (2017). Vitamin C and Immune Function. Nutrients.</w:t>
+      </w:r>
+      <w:r>
+        <w:rPr>
+          <w:rFonts w:ascii="Roboto" w:cs="Roboto" w:eastAsia="Roboto" w:hAnsi="Roboto"/>
+          <w:i/>
+          <w:iCs/>
+          <w:color w:val="000000"/>
+          <w:sz w:val="18"/>
+          <w:szCs w:val="18"/>
+        </w:rPr>
+        <w:t xml:space="preserve">  (Vitamin C)</w:t>
+      </w:r>
+    </w:p>
+    <w:p>
+      <w:pPr>
+        <w:spacing w:after="120"/>
+      </w:pPr>
+      <w:r>
+        <w:rPr>
+          <w:rFonts w:ascii="Roboto" w:cs="Roboto" w:eastAsia="Roboto" w:hAnsi="Roboto"/>
+          <w:b/>
+          <w:bCs/>
+          <w:color w:val="C3AF88"/>
+          <w:sz w:val="22"/>
+          <w:szCs w:val="22"/>
+        </w:rPr>
+        <w:t xml:space="preserve">[25]</w:t>
+      </w:r>
+      <w:r>
+        <w:rPr>
+          <w:rFonts w:ascii="Roboto" w:cs="Roboto" w:eastAsia="Roboto" w:hAnsi="Roboto"/>
+          <w:color w:val="000000"/>
+          <w:sz w:val="22"/>
+          <w:szCs w:val="22"/>
+        </w:rPr>
+        <w:t xml:space="preserve">  Holick MF et al. (2011). Evaluation, Treatment, and Prevention of Vitamin D Deficiency: an Endocrine Society Clinical Practice Guideline. Journal of Clinical Endocrinology &amp; Metabolism.</w:t>
+      </w:r>
+      <w:r>
+        <w:rPr>
+          <w:rFonts w:ascii="Roboto" w:cs="Roboto" w:eastAsia="Roboto" w:hAnsi="Roboto"/>
+          <w:i/>
+          <w:iCs/>
+          <w:color w:val="000000"/>
+          <w:sz w:val="18"/>
+          <w:szCs w:val="18"/>
+        </w:rPr>
+        <w:t xml:space="preserve">  (Vitamin D3 (colecalciferol))</w:t>
       </w:r>
     </w:p>
     <w:p>
@@ -5892,7 +5733,7 @@
           <w:sz w:val="18"/>
           <w:szCs w:val="18"/>
         </w:rPr>
-        <w:t xml:space="preserve">Submission: SUB-2026-004  •  Generated: 31 May 2026, 8:58 am</w:t>
+        <w:t xml:space="preserve">Submission: SUB-2026-NS-001  •  Generated: 12 Aug 2026, 4:16 pm</w:t>
       </w:r>
     </w:p>
     <w:p>
@@ -5908,7 +5749,7 @@
           <w:sz w:val="18"/>
           <w:szCs w:val="18"/>
         </w:rPr>
-        <w:t xml:space="preserve">Audit Reference: 8DF4-6DB0-C571</w:t>
+        <w:t xml:space="preserve">Audit Reference: 129D-708F-2BF7</w:t>
       </w:r>
     </w:p>
     <w:sectPr>

</xml_diff>